<commit_message>
Agregados antes del envío
</commit_message>
<xml_diff>
--- a/Informe.docx
+++ b/Informe.docx
@@ -244,7 +244,7 @@
                     <pic:cNvPicPr/>
                   </pic:nvPicPr>
                   <pic:blipFill>
-                    <a:blip r:embed="rId4"/>
+                    <a:blip r:embed="rId5"/>
                     <a:stretch>
                       <a:fillRect/>
                     </a:stretch>
@@ -291,7 +291,7 @@
                     <pic:cNvPicPr/>
                   </pic:nvPicPr>
                   <pic:blipFill>
-                    <a:blip r:embed="rId5"/>
+                    <a:blip r:embed="rId6"/>
                     <a:stretch>
                       <a:fillRect/>
                     </a:stretch>
@@ -429,15 +429,6 @@
         <w:jc w:val="center"/>
         <w:rPr>
           <w:rFonts w:ascii="Times New Roman" w:hAnsi="Times New Roman" w:cs="Times New Roman"/>
-          <w:color w:val="000000" w:themeColor="text1"/>
-          <w:sz w:val="72"/>
-          <w:szCs w:val="72"/>
-          <w:lang w:val="es-ES_tradnl"/>
-        </w:rPr>
-      </w:pPr>
-      <w:r>
-        <w:rPr>
-          <w:rFonts w:ascii="Times New Roman" w:hAnsi="Times New Roman" w:cs="Times New Roman"/>
           <w:b/>
           <w:bCs/>
           <w:color w:val="000000" w:themeColor="text1"/>
@@ -445,37 +436,18 @@
           <w:szCs w:val="72"/>
           <w:lang w:val="es-ES_tradnl"/>
         </w:rPr>
-        <w:t>Proyecto</w:t>
-      </w:r>
-      <w:r>
-        <w:rPr>
-          <w:rFonts w:ascii="Times New Roman" w:hAnsi="Times New Roman" w:cs="Times New Roman"/>
+      </w:pPr>
+      <w:r>
+        <w:rPr>
+          <w:rFonts w:ascii="Times New Roman" w:hAnsi="Times New Roman" w:cs="Times New Roman"/>
+          <w:b/>
+          <w:bCs/>
           <w:color w:val="000000" w:themeColor="text1"/>
           <w:sz w:val="72"/>
           <w:szCs w:val="72"/>
           <w:lang w:val="es-ES_tradnl"/>
         </w:rPr>
-        <w:t xml:space="preserve"> </w:t>
-      </w:r>
-      <w:r>
-        <w:rPr>
-          <w:rFonts w:ascii="Times New Roman" w:hAnsi="Times New Roman" w:cs="Times New Roman"/>
-          <w:color w:val="000000" w:themeColor="text1"/>
-          <w:sz w:val="72"/>
-          <w:szCs w:val="72"/>
-          <w:lang w:val="es-ES_tradnl"/>
-        </w:rPr>
-        <w:t>Fase II</w:t>
-      </w:r>
-      <w:r>
-        <w:rPr>
-          <w:rFonts w:ascii="Times New Roman" w:hAnsi="Times New Roman" w:cs="Times New Roman"/>
-          <w:color w:val="000000" w:themeColor="text1"/>
-          <w:sz w:val="72"/>
-          <w:szCs w:val="72"/>
-          <w:lang w:val="es-ES_tradnl"/>
-        </w:rPr>
-        <w:t xml:space="preserve"> </w:t>
+        <w:t xml:space="preserve">Proyecto Fase II </w:t>
       </w:r>
     </w:p>
     <w:p>
@@ -781,10 +753,2696 @@
     <w:p>
       <w:pPr>
         <w:jc w:val="center"/>
-      </w:pPr>
-      <w:r>
+        <w:rPr>
+          <w:rFonts w:ascii="Times New Roman" w:hAnsi="Times New Roman" w:cs="Times New Roman"/>
+        </w:rPr>
+      </w:pPr>
+      <w:r>
+        <w:rPr>
+          <w:rFonts w:ascii="Times New Roman" w:hAnsi="Times New Roman" w:cs="Times New Roman"/>
+        </w:rPr>
         <w:t>Caracas, 15 de septiembre de 2026</w:t>
       </w:r>
+    </w:p>
+    <w:p>
+      <w:pPr>
+        <w:rPr>
+          <w:rFonts w:ascii="Times New Roman" w:hAnsi="Times New Roman" w:cs="Times New Roman"/>
+        </w:rPr>
+      </w:pPr>
+    </w:p>
+    <w:p>
+      <w:pPr>
+        <w:rPr>
+          <w:rFonts w:ascii="Times New Roman" w:hAnsi="Times New Roman" w:cs="Times New Roman"/>
+          <w:b/>
+          <w:bCs/>
+        </w:rPr>
+      </w:pPr>
+      <w:r>
+        <w:rPr>
+          <w:rFonts w:ascii="Times New Roman" w:hAnsi="Times New Roman" w:cs="Times New Roman"/>
+          <w:b/>
+          <w:bCs/>
+        </w:rPr>
+        <w:lastRenderedPageBreak/>
+        <w:t>2. Asunciones del Proyecto</w:t>
+      </w:r>
+    </w:p>
+    <w:p>
+      <w:pPr>
+        <w:rPr>
+          <w:rFonts w:ascii="Times New Roman" w:hAnsi="Times New Roman" w:cs="Times New Roman"/>
+        </w:rPr>
+      </w:pPr>
+      <w:r>
+        <w:rPr>
+          <w:rFonts w:ascii="Times New Roman" w:hAnsi="Times New Roman" w:cs="Times New Roman"/>
+        </w:rPr>
+        <w:t xml:space="preserve">Basado en el análisis del esquema relacional, las consideraciones generales y los dominios de negocio definidos para la plataforma de distribución digital </w:t>
+      </w:r>
+      <w:proofErr w:type="spellStart"/>
+      <w:r>
+        <w:rPr>
+          <w:rFonts w:ascii="Times New Roman" w:hAnsi="Times New Roman" w:cs="Times New Roman"/>
+        </w:rPr>
+        <w:t>ConeSTeam</w:t>
+      </w:r>
+      <w:proofErr w:type="spellEnd"/>
+      <w:r>
+        <w:rPr>
+          <w:rFonts w:ascii="Times New Roman" w:hAnsi="Times New Roman" w:cs="Times New Roman"/>
+        </w:rPr>
+        <w:t>, se establecen las siguientes asunciones técnicas y de diseño:</w:t>
+      </w:r>
+    </w:p>
+    <w:p>
+      <w:pPr>
+        <w:rPr>
+          <w:rFonts w:ascii="Times New Roman" w:hAnsi="Times New Roman" w:cs="Times New Roman"/>
+        </w:rPr>
+      </w:pPr>
+      <w:r>
+        <w:rPr>
+          <w:rFonts w:ascii="Times New Roman" w:hAnsi="Times New Roman" w:cs="Times New Roman"/>
+        </w:rPr>
+        <w:br/>
+      </w:r>
+    </w:p>
+    <w:p>
+      <w:pPr>
+        <w:rPr>
+          <w:rFonts w:ascii="Times New Roman" w:hAnsi="Times New Roman" w:cs="Times New Roman"/>
+          <w:b/>
+          <w:bCs/>
+        </w:rPr>
+      </w:pPr>
+      <w:r>
+        <w:rPr>
+          <w:rFonts w:ascii="Times New Roman" w:hAnsi="Times New Roman" w:cs="Times New Roman"/>
+          <w:b/>
+          <w:bCs/>
+        </w:rPr>
+        <w:t>A. Tipos de Datos y Precisión Numérica</w:t>
+      </w:r>
+    </w:p>
+    <w:p>
+      <w:pPr>
+        <w:numPr>
+          <w:ilvl w:val="0"/>
+          <w:numId w:val="2"/>
+        </w:numPr>
+        <w:rPr>
+          <w:rFonts w:ascii="Times New Roman" w:hAnsi="Times New Roman" w:cs="Times New Roman"/>
+        </w:rPr>
+      </w:pPr>
+      <w:r>
+        <w:rPr>
+          <w:rFonts w:ascii="Times New Roman" w:hAnsi="Times New Roman" w:cs="Times New Roman"/>
+          <w:b/>
+          <w:bCs/>
+        </w:rPr>
+        <w:t>Campos Monetarios y Financieros:</w:t>
+      </w:r>
+      <w:r>
+        <w:rPr>
+          <w:rFonts w:ascii="Times New Roman" w:hAnsi="Times New Roman" w:cs="Times New Roman"/>
+        </w:rPr>
+        <w:t xml:space="preserve"> Se utiliza el tipo de dato </w:t>
+      </w:r>
+      <w:proofErr w:type="gramStart"/>
+      <w:r>
+        <w:rPr>
+          <w:rFonts w:ascii="Times New Roman" w:hAnsi="Times New Roman" w:cs="Times New Roman"/>
+        </w:rPr>
+        <w:t>DECIMAL(</w:t>
+      </w:r>
+      <w:proofErr w:type="gramEnd"/>
+      <w:r>
+        <w:rPr>
+          <w:rFonts w:ascii="Times New Roman" w:hAnsi="Times New Roman" w:cs="Times New Roman"/>
+        </w:rPr>
+        <w:t>10,2) para todos los campos relacionados con precios (</w:t>
+      </w:r>
+      <w:proofErr w:type="spellStart"/>
+      <w:r>
+        <w:rPr>
+          <w:rFonts w:ascii="Times New Roman" w:hAnsi="Times New Roman" w:cs="Times New Roman"/>
+        </w:rPr>
+        <w:t>Precio_Base_Actual</w:t>
+      </w:r>
+      <w:proofErr w:type="spellEnd"/>
+      <w:r>
+        <w:rPr>
+          <w:rFonts w:ascii="Times New Roman" w:hAnsi="Times New Roman" w:cs="Times New Roman"/>
+        </w:rPr>
+        <w:t xml:space="preserve">, </w:t>
+      </w:r>
+      <w:proofErr w:type="spellStart"/>
+      <w:r>
+        <w:rPr>
+          <w:rFonts w:ascii="Times New Roman" w:hAnsi="Times New Roman" w:cs="Times New Roman"/>
+        </w:rPr>
+        <w:t>Sub_Total</w:t>
+      </w:r>
+      <w:proofErr w:type="spellEnd"/>
+      <w:r>
+        <w:rPr>
+          <w:rFonts w:ascii="Times New Roman" w:hAnsi="Times New Roman" w:cs="Times New Roman"/>
+        </w:rPr>
+        <w:t xml:space="preserve">, </w:t>
+      </w:r>
+      <w:proofErr w:type="spellStart"/>
+      <w:r>
+        <w:rPr>
+          <w:rFonts w:ascii="Times New Roman" w:hAnsi="Times New Roman" w:cs="Times New Roman"/>
+        </w:rPr>
+        <w:t>Monto_Descuento</w:t>
+      </w:r>
+      <w:proofErr w:type="spellEnd"/>
+      <w:r>
+        <w:rPr>
+          <w:rFonts w:ascii="Times New Roman" w:hAnsi="Times New Roman" w:cs="Times New Roman"/>
+        </w:rPr>
+        <w:t xml:space="preserve">, </w:t>
+      </w:r>
+      <w:proofErr w:type="spellStart"/>
+      <w:r>
+        <w:rPr>
+          <w:rFonts w:ascii="Times New Roman" w:hAnsi="Times New Roman" w:cs="Times New Roman"/>
+        </w:rPr>
+        <w:t>Monto_Impuesto</w:t>
+      </w:r>
+      <w:proofErr w:type="spellEnd"/>
+      <w:r>
+        <w:rPr>
+          <w:rFonts w:ascii="Times New Roman" w:hAnsi="Times New Roman" w:cs="Times New Roman"/>
+        </w:rPr>
+        <w:t xml:space="preserve">, </w:t>
+      </w:r>
+      <w:proofErr w:type="spellStart"/>
+      <w:r>
+        <w:rPr>
+          <w:rFonts w:ascii="Times New Roman" w:hAnsi="Times New Roman" w:cs="Times New Roman"/>
+        </w:rPr>
+        <w:t>Total_Pagado</w:t>
+      </w:r>
+      <w:proofErr w:type="spellEnd"/>
+      <w:r>
+        <w:rPr>
+          <w:rFonts w:ascii="Times New Roman" w:hAnsi="Times New Roman" w:cs="Times New Roman"/>
+        </w:rPr>
+        <w:t xml:space="preserve">, </w:t>
+      </w:r>
+      <w:proofErr w:type="spellStart"/>
+      <w:r>
+        <w:rPr>
+          <w:rFonts w:ascii="Times New Roman" w:hAnsi="Times New Roman" w:cs="Times New Roman"/>
+        </w:rPr>
+        <w:t>Precio_Venta_Historico</w:t>
+      </w:r>
+      <w:proofErr w:type="spellEnd"/>
+      <w:r>
+        <w:rPr>
+          <w:rFonts w:ascii="Times New Roman" w:hAnsi="Times New Roman" w:cs="Times New Roman"/>
+        </w:rPr>
+        <w:t xml:space="preserve">, </w:t>
+      </w:r>
+      <w:proofErr w:type="spellStart"/>
+      <w:r>
+        <w:rPr>
+          <w:rFonts w:ascii="Times New Roman" w:hAnsi="Times New Roman" w:cs="Times New Roman"/>
+        </w:rPr>
+        <w:t>Monto_Reembolsado</w:t>
+      </w:r>
+      <w:proofErr w:type="spellEnd"/>
+      <w:r>
+        <w:rPr>
+          <w:rFonts w:ascii="Times New Roman" w:hAnsi="Times New Roman" w:cs="Times New Roman"/>
+        </w:rPr>
+        <w:t>), garantizando exactitud aritmética de hasta dos decimales y evitando errores de redondeo propios de tipos de coma flotante.</w:t>
+      </w:r>
+    </w:p>
+    <w:p>
+      <w:pPr>
+        <w:rPr>
+          <w:rFonts w:ascii="Times New Roman" w:hAnsi="Times New Roman" w:cs="Times New Roman"/>
+        </w:rPr>
+      </w:pPr>
+    </w:p>
+    <w:p>
+      <w:pPr>
+        <w:numPr>
+          <w:ilvl w:val="0"/>
+          <w:numId w:val="2"/>
+        </w:numPr>
+        <w:rPr>
+          <w:rFonts w:ascii="Times New Roman" w:hAnsi="Times New Roman" w:cs="Times New Roman"/>
+        </w:rPr>
+      </w:pPr>
+      <w:r>
+        <w:rPr>
+          <w:rFonts w:ascii="Times New Roman" w:hAnsi="Times New Roman" w:cs="Times New Roman"/>
+          <w:b/>
+          <w:bCs/>
+        </w:rPr>
+        <w:t>Tamaños y Pesos:</w:t>
+      </w:r>
+      <w:r>
+        <w:rPr>
+          <w:rFonts w:ascii="Times New Roman" w:hAnsi="Times New Roman" w:cs="Times New Roman"/>
+        </w:rPr>
+        <w:t xml:space="preserve"> El tamaño de almacenamiento de los productos (</w:t>
+      </w:r>
+      <w:proofErr w:type="spellStart"/>
+      <w:r>
+        <w:rPr>
+          <w:rFonts w:ascii="Times New Roman" w:hAnsi="Times New Roman" w:cs="Times New Roman"/>
+        </w:rPr>
+        <w:t>Tamano_GB</w:t>
+      </w:r>
+      <w:proofErr w:type="spellEnd"/>
+      <w:r>
+        <w:rPr>
+          <w:rFonts w:ascii="Times New Roman" w:hAnsi="Times New Roman" w:cs="Times New Roman"/>
+        </w:rPr>
+        <w:t xml:space="preserve"> en </w:t>
+      </w:r>
+      <w:proofErr w:type="spellStart"/>
+      <w:r>
+        <w:rPr>
+          <w:rFonts w:ascii="Times New Roman" w:hAnsi="Times New Roman" w:cs="Times New Roman"/>
+        </w:rPr>
+        <w:t>Producto_Digital</w:t>
+      </w:r>
+      <w:proofErr w:type="spellEnd"/>
+      <w:r>
+        <w:rPr>
+          <w:rFonts w:ascii="Times New Roman" w:hAnsi="Times New Roman" w:cs="Times New Roman"/>
+        </w:rPr>
+        <w:t xml:space="preserve"> y </w:t>
+      </w:r>
+      <w:proofErr w:type="spellStart"/>
+      <w:r>
+        <w:rPr>
+          <w:rFonts w:ascii="Times New Roman" w:hAnsi="Times New Roman" w:cs="Times New Roman"/>
+        </w:rPr>
+        <w:t>Tamano_MB</w:t>
+      </w:r>
+      <w:proofErr w:type="spellEnd"/>
+      <w:r>
+        <w:rPr>
+          <w:rFonts w:ascii="Times New Roman" w:hAnsi="Times New Roman" w:cs="Times New Roman"/>
+        </w:rPr>
+        <w:t xml:space="preserve"> en Mod) se modela con </w:t>
+      </w:r>
+      <w:proofErr w:type="gramStart"/>
+      <w:r>
+        <w:rPr>
+          <w:rFonts w:ascii="Times New Roman" w:hAnsi="Times New Roman" w:cs="Times New Roman"/>
+        </w:rPr>
+        <w:t>DECIMAL(</w:t>
+      </w:r>
+      <w:proofErr w:type="gramEnd"/>
+      <w:r>
+        <w:rPr>
+          <w:rFonts w:ascii="Times New Roman" w:hAnsi="Times New Roman" w:cs="Times New Roman"/>
+        </w:rPr>
+        <w:t>10,2) para admitir mediciones fraccionadas precisas.</w:t>
+      </w:r>
+    </w:p>
+    <w:p>
+      <w:pPr>
+        <w:rPr>
+          <w:rFonts w:ascii="Times New Roman" w:hAnsi="Times New Roman" w:cs="Times New Roman"/>
+        </w:rPr>
+      </w:pPr>
+    </w:p>
+    <w:p>
+      <w:pPr>
+        <w:numPr>
+          <w:ilvl w:val="0"/>
+          <w:numId w:val="2"/>
+        </w:numPr>
+        <w:rPr>
+          <w:rFonts w:ascii="Times New Roman" w:hAnsi="Times New Roman" w:cs="Times New Roman"/>
+        </w:rPr>
+      </w:pPr>
+      <w:r>
+        <w:rPr>
+          <w:rFonts w:ascii="Times New Roman" w:hAnsi="Times New Roman" w:cs="Times New Roman"/>
+          <w:b/>
+          <w:bCs/>
+        </w:rPr>
+        <w:t>Identificadores y Llaves Primarias:</w:t>
+      </w:r>
+      <w:r>
+        <w:rPr>
+          <w:rFonts w:ascii="Times New Roman" w:hAnsi="Times New Roman" w:cs="Times New Roman"/>
+        </w:rPr>
+        <w:t xml:space="preserve"> Las tablas principales independientes emplean claves primarias </w:t>
+      </w:r>
+      <w:proofErr w:type="spellStart"/>
+      <w:r>
+        <w:rPr>
+          <w:rFonts w:ascii="Times New Roman" w:hAnsi="Times New Roman" w:cs="Times New Roman"/>
+        </w:rPr>
+        <w:t>autoincrementables</w:t>
+      </w:r>
+      <w:proofErr w:type="spellEnd"/>
+      <w:r>
+        <w:rPr>
+          <w:rFonts w:ascii="Times New Roman" w:hAnsi="Times New Roman" w:cs="Times New Roman"/>
+        </w:rPr>
+        <w:t xml:space="preserve"> (</w:t>
+      </w:r>
+      <w:proofErr w:type="gramStart"/>
+      <w:r>
+        <w:rPr>
+          <w:rFonts w:ascii="Times New Roman" w:hAnsi="Times New Roman" w:cs="Times New Roman"/>
+        </w:rPr>
+        <w:t>IDENTITY(</w:t>
+      </w:r>
+      <w:proofErr w:type="gramEnd"/>
+      <w:r>
+        <w:rPr>
+          <w:rFonts w:ascii="Times New Roman" w:hAnsi="Times New Roman" w:cs="Times New Roman"/>
+        </w:rPr>
+        <w:t>1,1)), mientras que las relaciones débiles por identificación y tablas asociativas de muchos a muchos utilizan claves compuestas (PK/FK).</w:t>
+      </w:r>
+    </w:p>
+    <w:p>
+      <w:pPr>
+        <w:rPr>
+          <w:rFonts w:ascii="Times New Roman" w:hAnsi="Times New Roman" w:cs="Times New Roman"/>
+        </w:rPr>
+      </w:pPr>
+    </w:p>
+    <w:p>
+      <w:pPr>
+        <w:numPr>
+          <w:ilvl w:val="0"/>
+          <w:numId w:val="2"/>
+        </w:numPr>
+        <w:rPr>
+          <w:rFonts w:ascii="Times New Roman" w:hAnsi="Times New Roman" w:cs="Times New Roman"/>
+        </w:rPr>
+      </w:pPr>
+      <w:r>
+        <w:rPr>
+          <w:rFonts w:ascii="Times New Roman" w:hAnsi="Times New Roman" w:cs="Times New Roman"/>
+          <w:b/>
+          <w:bCs/>
+        </w:rPr>
+        <w:t>Indicadores Lógicos (Booleanos):</w:t>
+      </w:r>
+      <w:r>
+        <w:rPr>
+          <w:rFonts w:ascii="Times New Roman" w:hAnsi="Times New Roman" w:cs="Times New Roman"/>
+        </w:rPr>
+        <w:t xml:space="preserve"> Todos los atributos de naturaleza binaria o dicotómica (</w:t>
+      </w:r>
+      <w:proofErr w:type="spellStart"/>
+      <w:r>
+        <w:rPr>
+          <w:rFonts w:ascii="Times New Roman" w:hAnsi="Times New Roman" w:cs="Times New Roman"/>
+        </w:rPr>
+        <w:t>Es_Secreto</w:t>
+      </w:r>
+      <w:proofErr w:type="spellEnd"/>
+      <w:r>
+        <w:rPr>
+          <w:rFonts w:ascii="Times New Roman" w:hAnsi="Times New Roman" w:cs="Times New Roman"/>
+        </w:rPr>
+        <w:t xml:space="preserve">, </w:t>
+      </w:r>
+      <w:proofErr w:type="spellStart"/>
+      <w:r>
+        <w:rPr>
+          <w:rFonts w:ascii="Times New Roman" w:hAnsi="Times New Roman" w:cs="Times New Roman"/>
+        </w:rPr>
+        <w:t>Tiene_Compras_InGame</w:t>
+      </w:r>
+      <w:proofErr w:type="spellEnd"/>
+      <w:r>
+        <w:rPr>
+          <w:rFonts w:ascii="Times New Roman" w:hAnsi="Times New Roman" w:cs="Times New Roman"/>
+        </w:rPr>
+        <w:t xml:space="preserve">, </w:t>
+      </w:r>
+      <w:proofErr w:type="spellStart"/>
+      <w:r>
+        <w:rPr>
+          <w:rFonts w:ascii="Times New Roman" w:hAnsi="Times New Roman" w:cs="Times New Roman"/>
+        </w:rPr>
+        <w:t>Soporta_Cloud_Saves</w:t>
+      </w:r>
+      <w:proofErr w:type="spellEnd"/>
+      <w:r>
+        <w:rPr>
+          <w:rFonts w:ascii="Times New Roman" w:hAnsi="Times New Roman" w:cs="Times New Roman"/>
+        </w:rPr>
+        <w:t xml:space="preserve">, </w:t>
+      </w:r>
+      <w:proofErr w:type="spellStart"/>
+      <w:r>
+        <w:rPr>
+          <w:rFonts w:ascii="Times New Roman" w:hAnsi="Times New Roman" w:cs="Times New Roman"/>
+        </w:rPr>
+        <w:t>Soporta_Interfaz</w:t>
+      </w:r>
+      <w:proofErr w:type="spellEnd"/>
+      <w:r>
+        <w:rPr>
+          <w:rFonts w:ascii="Times New Roman" w:hAnsi="Times New Roman" w:cs="Times New Roman"/>
+        </w:rPr>
+        <w:t xml:space="preserve">, </w:t>
+      </w:r>
+      <w:proofErr w:type="spellStart"/>
+      <w:r>
+        <w:rPr>
+          <w:rFonts w:ascii="Times New Roman" w:hAnsi="Times New Roman" w:cs="Times New Roman"/>
+        </w:rPr>
+        <w:t>Soporta_Audio</w:t>
+      </w:r>
+      <w:proofErr w:type="spellEnd"/>
+      <w:r>
+        <w:rPr>
+          <w:rFonts w:ascii="Times New Roman" w:hAnsi="Times New Roman" w:cs="Times New Roman"/>
+        </w:rPr>
+        <w:t xml:space="preserve">, </w:t>
+      </w:r>
+      <w:proofErr w:type="spellStart"/>
+      <w:r>
+        <w:rPr>
+          <w:rFonts w:ascii="Times New Roman" w:hAnsi="Times New Roman" w:cs="Times New Roman"/>
+        </w:rPr>
+        <w:t>Soporta_Subtitulos</w:t>
+      </w:r>
+      <w:proofErr w:type="spellEnd"/>
+      <w:r>
+        <w:rPr>
+          <w:rFonts w:ascii="Times New Roman" w:hAnsi="Times New Roman" w:cs="Times New Roman"/>
+        </w:rPr>
+        <w:t xml:space="preserve">, </w:t>
+      </w:r>
+      <w:proofErr w:type="spellStart"/>
+      <w:r>
+        <w:rPr>
+          <w:rFonts w:ascii="Times New Roman" w:hAnsi="Times New Roman" w:cs="Times New Roman"/>
+        </w:rPr>
+        <w:t>Notificar_Descuento</w:t>
+      </w:r>
+      <w:proofErr w:type="spellEnd"/>
+      <w:r>
+        <w:rPr>
+          <w:rFonts w:ascii="Times New Roman" w:hAnsi="Times New Roman" w:cs="Times New Roman"/>
+        </w:rPr>
+        <w:t xml:space="preserve">, </w:t>
+      </w:r>
+      <w:proofErr w:type="spellStart"/>
+      <w:r>
+        <w:rPr>
+          <w:rFonts w:ascii="Times New Roman" w:hAnsi="Times New Roman" w:cs="Times New Roman"/>
+        </w:rPr>
+        <w:t>Requiere_Validacion</w:t>
+      </w:r>
+      <w:proofErr w:type="spellEnd"/>
+      <w:r>
+        <w:rPr>
+          <w:rFonts w:ascii="Times New Roman" w:hAnsi="Times New Roman" w:cs="Times New Roman"/>
+        </w:rPr>
+        <w:t xml:space="preserve">, </w:t>
+      </w:r>
+      <w:proofErr w:type="spellStart"/>
+      <w:r>
+        <w:rPr>
+          <w:rFonts w:ascii="Times New Roman" w:hAnsi="Times New Roman" w:cs="Times New Roman"/>
+        </w:rPr>
+        <w:t>Es_Critica_Especializada</w:t>
+      </w:r>
+      <w:proofErr w:type="spellEnd"/>
+      <w:r>
+        <w:rPr>
+          <w:rFonts w:ascii="Times New Roman" w:hAnsi="Times New Roman" w:cs="Times New Roman"/>
+        </w:rPr>
+        <w:t>) se implementan utilizando el tipo de dato nativo BIT (1 / 0).</w:t>
+      </w:r>
+    </w:p>
+    <w:p>
+      <w:pPr>
+        <w:rPr>
+          <w:rFonts w:ascii="Times New Roman" w:hAnsi="Times New Roman" w:cs="Times New Roman"/>
+        </w:rPr>
+      </w:pPr>
+    </w:p>
+    <w:p>
+      <w:pPr>
+        <w:numPr>
+          <w:ilvl w:val="0"/>
+          <w:numId w:val="2"/>
+        </w:numPr>
+        <w:rPr>
+          <w:rFonts w:ascii="Times New Roman" w:hAnsi="Times New Roman" w:cs="Times New Roman"/>
+        </w:rPr>
+      </w:pPr>
+      <w:r>
+        <w:rPr>
+          <w:rFonts w:ascii="Times New Roman" w:hAnsi="Times New Roman" w:cs="Times New Roman"/>
+          <w:b/>
+          <w:bCs/>
+        </w:rPr>
+        <w:t>Fechas y Tiempos:</w:t>
+      </w:r>
+      <w:r>
+        <w:rPr>
+          <w:rFonts w:ascii="Times New Roman" w:hAnsi="Times New Roman" w:cs="Times New Roman"/>
+        </w:rPr>
+        <w:t xml:space="preserve"> Se emplea DATE para fechas de nacimiento, fundación, registro y transacciones diarias, y DATETIME2 o DATE según la granularidad requerida para marcas de tiempo de emisión.</w:t>
+      </w:r>
+    </w:p>
+    <w:p>
+      <w:pPr>
+        <w:rPr>
+          <w:rFonts w:ascii="Times New Roman" w:hAnsi="Times New Roman" w:cs="Times New Roman"/>
+        </w:rPr>
+      </w:pPr>
+    </w:p>
+    <w:p>
+      <w:pPr>
+        <w:rPr>
+          <w:rFonts w:ascii="Times New Roman" w:hAnsi="Times New Roman" w:cs="Times New Roman"/>
+          <w:b/>
+          <w:bCs/>
+        </w:rPr>
+      </w:pPr>
+      <w:r>
+        <w:rPr>
+          <w:rFonts w:ascii="Times New Roman" w:hAnsi="Times New Roman" w:cs="Times New Roman"/>
+          <w:b/>
+          <w:bCs/>
+        </w:rPr>
+        <w:t>B. Restricciones de Integridad y Dominio (</w:t>
+      </w:r>
+      <w:r>
+        <w:rPr>
+          <w:rFonts w:ascii="Times New Roman" w:hAnsi="Times New Roman" w:cs="Times New Roman"/>
+        </w:rPr>
+        <w:t>CHECK</w:t>
+      </w:r>
+      <w:r>
+        <w:rPr>
+          <w:rFonts w:ascii="Times New Roman" w:hAnsi="Times New Roman" w:cs="Times New Roman"/>
+          <w:b/>
+          <w:bCs/>
+        </w:rPr>
+        <w:t xml:space="preserve"> </w:t>
+      </w:r>
+      <w:proofErr w:type="spellStart"/>
+      <w:r>
+        <w:rPr>
+          <w:rFonts w:ascii="Times New Roman" w:hAnsi="Times New Roman" w:cs="Times New Roman"/>
+          <w:b/>
+          <w:bCs/>
+        </w:rPr>
+        <w:t>Constraints</w:t>
+      </w:r>
+      <w:proofErr w:type="spellEnd"/>
+      <w:r>
+        <w:rPr>
+          <w:rFonts w:ascii="Times New Roman" w:hAnsi="Times New Roman" w:cs="Times New Roman"/>
+          <w:b/>
+          <w:bCs/>
+        </w:rPr>
+        <w:t>)</w:t>
+      </w:r>
+    </w:p>
+    <w:p>
+      <w:pPr>
+        <w:numPr>
+          <w:ilvl w:val="0"/>
+          <w:numId w:val="3"/>
+        </w:numPr>
+        <w:rPr>
+          <w:rFonts w:ascii="Times New Roman" w:hAnsi="Times New Roman" w:cs="Times New Roman"/>
+        </w:rPr>
+      </w:pPr>
+      <w:r>
+        <w:rPr>
+          <w:rFonts w:ascii="Times New Roman" w:hAnsi="Times New Roman" w:cs="Times New Roman"/>
+          <w:b/>
+          <w:bCs/>
+        </w:rPr>
+        <w:t>Validación de Edad y Nacimiento:</w:t>
+      </w:r>
+      <w:r>
+        <w:rPr>
+          <w:rFonts w:ascii="Times New Roman" w:hAnsi="Times New Roman" w:cs="Times New Roman"/>
+        </w:rPr>
+        <w:t xml:space="preserve"> Se restringe la edad mínima de registro de usuarios a 13 años mediante la condición </w:t>
+      </w:r>
+      <w:proofErr w:type="gramStart"/>
+      <w:r>
+        <w:rPr>
+          <w:rFonts w:ascii="Times New Roman" w:hAnsi="Times New Roman" w:cs="Times New Roman"/>
+        </w:rPr>
+        <w:t>DATEDIFF(</w:t>
+      </w:r>
+      <w:proofErr w:type="gramEnd"/>
+      <w:r>
+        <w:rPr>
+          <w:rFonts w:ascii="Times New Roman" w:hAnsi="Times New Roman" w:cs="Times New Roman"/>
+        </w:rPr>
+        <w:t xml:space="preserve">YEAR, </w:t>
+      </w:r>
+      <w:proofErr w:type="spellStart"/>
+      <w:r>
+        <w:rPr>
+          <w:rFonts w:ascii="Times New Roman" w:hAnsi="Times New Roman" w:cs="Times New Roman"/>
+        </w:rPr>
+        <w:t>Fecha_Nacimiento</w:t>
+      </w:r>
+      <w:proofErr w:type="spellEnd"/>
+      <w:r>
+        <w:rPr>
+          <w:rFonts w:ascii="Times New Roman" w:hAnsi="Times New Roman" w:cs="Times New Roman"/>
+        </w:rPr>
+        <w:t xml:space="preserve">, </w:t>
+      </w:r>
+      <w:proofErr w:type="gramStart"/>
+      <w:r>
+        <w:rPr>
+          <w:rFonts w:ascii="Times New Roman" w:hAnsi="Times New Roman" w:cs="Times New Roman"/>
+        </w:rPr>
+        <w:t>GETDATE(</w:t>
+      </w:r>
+      <w:proofErr w:type="gramEnd"/>
+      <w:r>
+        <w:rPr>
+          <w:rFonts w:ascii="Times New Roman" w:hAnsi="Times New Roman" w:cs="Times New Roman"/>
+        </w:rPr>
+        <w:t xml:space="preserve">)) &gt;= 13. Asimismo, la compra de productos con clasificación para adultos ('M', 'AO') está protegida mediante lógica transaccional y </w:t>
+      </w:r>
+      <w:proofErr w:type="spellStart"/>
+      <w:r>
+        <w:rPr>
+          <w:rFonts w:ascii="Times New Roman" w:hAnsi="Times New Roman" w:cs="Times New Roman"/>
+        </w:rPr>
+        <w:t>triggers</w:t>
+      </w:r>
+      <w:proofErr w:type="spellEnd"/>
+      <w:r>
+        <w:rPr>
+          <w:rFonts w:ascii="Times New Roman" w:hAnsi="Times New Roman" w:cs="Times New Roman"/>
+        </w:rPr>
+        <w:t xml:space="preserve"> de validación de mayoría de edad.</w:t>
+      </w:r>
+    </w:p>
+    <w:p>
+      <w:pPr>
+        <w:rPr>
+          <w:rFonts w:ascii="Times New Roman" w:hAnsi="Times New Roman" w:cs="Times New Roman"/>
+        </w:rPr>
+      </w:pPr>
+    </w:p>
+    <w:p>
+      <w:pPr>
+        <w:numPr>
+          <w:ilvl w:val="0"/>
+          <w:numId w:val="3"/>
+        </w:numPr>
+        <w:rPr>
+          <w:rFonts w:ascii="Times New Roman" w:hAnsi="Times New Roman" w:cs="Times New Roman"/>
+        </w:rPr>
+      </w:pPr>
+      <w:r>
+        <w:rPr>
+          <w:rFonts w:ascii="Times New Roman" w:hAnsi="Times New Roman" w:cs="Times New Roman"/>
+          <w:b/>
+          <w:bCs/>
+        </w:rPr>
+        <w:t>Restricciones Financieras:</w:t>
+      </w:r>
+      <w:r>
+        <w:rPr>
+          <w:rFonts w:ascii="Times New Roman" w:hAnsi="Times New Roman" w:cs="Times New Roman"/>
+        </w:rPr>
+        <w:t xml:space="preserve"> Ningún campo monetario admite valores negativos (&gt;= 0). Se permite explícitamente el precio base de 0 para productos gratuitos o </w:t>
+      </w:r>
+      <w:proofErr w:type="spellStart"/>
+      <w:r>
+        <w:rPr>
+          <w:rFonts w:ascii="Times New Roman" w:hAnsi="Times New Roman" w:cs="Times New Roman"/>
+        </w:rPr>
+        <w:t>DLCs</w:t>
+      </w:r>
+      <w:proofErr w:type="spellEnd"/>
+      <w:r>
+        <w:rPr>
+          <w:rFonts w:ascii="Times New Roman" w:hAnsi="Times New Roman" w:cs="Times New Roman"/>
+        </w:rPr>
+        <w:t xml:space="preserve"> promocionales.</w:t>
+      </w:r>
+    </w:p>
+    <w:p>
+      <w:pPr>
+        <w:rPr>
+          <w:rFonts w:ascii="Times New Roman" w:hAnsi="Times New Roman" w:cs="Times New Roman"/>
+        </w:rPr>
+      </w:pPr>
+    </w:p>
+    <w:p>
+      <w:pPr>
+        <w:numPr>
+          <w:ilvl w:val="0"/>
+          <w:numId w:val="3"/>
+        </w:numPr>
+        <w:rPr>
+          <w:rFonts w:ascii="Times New Roman" w:hAnsi="Times New Roman" w:cs="Times New Roman"/>
+        </w:rPr>
+      </w:pPr>
+      <w:r>
+        <w:rPr>
+          <w:rFonts w:ascii="Times New Roman" w:hAnsi="Times New Roman" w:cs="Times New Roman"/>
+          <w:b/>
+          <w:bCs/>
+        </w:rPr>
+        <w:t>Dominios Estrictos:</w:t>
+      </w:r>
+    </w:p>
+    <w:p>
+      <w:pPr>
+        <w:rPr>
+          <w:rFonts w:ascii="Times New Roman" w:hAnsi="Times New Roman" w:cs="Times New Roman"/>
+        </w:rPr>
+      </w:pPr>
+      <w:r>
+        <w:rPr>
+          <w:rFonts w:ascii="Times New Roman" w:hAnsi="Times New Roman" w:cs="Times New Roman"/>
+        </w:rPr>
+        <w:br/>
+      </w:r>
+    </w:p>
+    <w:p>
+      <w:pPr>
+        <w:numPr>
+          <w:ilvl w:val="1"/>
+          <w:numId w:val="3"/>
+        </w:numPr>
+        <w:rPr>
+          <w:rFonts w:ascii="Times New Roman" w:hAnsi="Times New Roman" w:cs="Times New Roman"/>
+        </w:rPr>
+      </w:pPr>
+      <w:proofErr w:type="spellStart"/>
+      <w:r>
+        <w:rPr>
+          <w:rFonts w:ascii="Times New Roman" w:hAnsi="Times New Roman" w:cs="Times New Roman"/>
+        </w:rPr>
+        <w:t>Tipo_Producto</w:t>
+      </w:r>
+      <w:proofErr w:type="spellEnd"/>
+      <w:r>
+        <w:rPr>
+          <w:rFonts w:ascii="Times New Roman" w:hAnsi="Times New Roman" w:cs="Times New Roman"/>
+        </w:rPr>
+        <w:t xml:space="preserve"> limitado a {'</w:t>
+      </w:r>
+      <w:proofErr w:type="spellStart"/>
+      <w:r>
+        <w:rPr>
+          <w:rFonts w:ascii="Times New Roman" w:hAnsi="Times New Roman" w:cs="Times New Roman"/>
+        </w:rPr>
+        <w:t>Juego_Base</w:t>
+      </w:r>
+      <w:proofErr w:type="spellEnd"/>
+      <w:r>
+        <w:rPr>
+          <w:rFonts w:ascii="Times New Roman" w:hAnsi="Times New Roman" w:cs="Times New Roman"/>
+        </w:rPr>
+        <w:t>', 'DLC'}.</w:t>
+      </w:r>
+    </w:p>
+    <w:p>
+      <w:pPr>
+        <w:rPr>
+          <w:rFonts w:ascii="Times New Roman" w:hAnsi="Times New Roman" w:cs="Times New Roman"/>
+        </w:rPr>
+      </w:pPr>
+    </w:p>
+    <w:p>
+      <w:pPr>
+        <w:numPr>
+          <w:ilvl w:val="1"/>
+          <w:numId w:val="3"/>
+        </w:numPr>
+        <w:rPr>
+          <w:rFonts w:ascii="Times New Roman" w:hAnsi="Times New Roman" w:cs="Times New Roman"/>
+        </w:rPr>
+      </w:pPr>
+      <w:proofErr w:type="spellStart"/>
+      <w:r>
+        <w:rPr>
+          <w:rFonts w:ascii="Times New Roman" w:hAnsi="Times New Roman" w:cs="Times New Roman"/>
+        </w:rPr>
+        <w:t>Clasificacion_Edad</w:t>
+      </w:r>
+      <w:proofErr w:type="spellEnd"/>
+      <w:r>
+        <w:rPr>
+          <w:rFonts w:ascii="Times New Roman" w:hAnsi="Times New Roman" w:cs="Times New Roman"/>
+        </w:rPr>
+        <w:t xml:space="preserve"> restringida a los estándares ESRB {'E', 'T', 'M', 'AO'}.</w:t>
+      </w:r>
+    </w:p>
+    <w:p>
+      <w:pPr>
+        <w:rPr>
+          <w:rFonts w:ascii="Times New Roman" w:hAnsi="Times New Roman" w:cs="Times New Roman"/>
+        </w:rPr>
+      </w:pPr>
+    </w:p>
+    <w:p>
+      <w:pPr>
+        <w:numPr>
+          <w:ilvl w:val="1"/>
+          <w:numId w:val="3"/>
+        </w:numPr>
+        <w:rPr>
+          <w:rFonts w:ascii="Times New Roman" w:hAnsi="Times New Roman" w:cs="Times New Roman"/>
+        </w:rPr>
+      </w:pPr>
+      <w:proofErr w:type="spellStart"/>
+      <w:r>
+        <w:rPr>
+          <w:rFonts w:ascii="Times New Roman" w:hAnsi="Times New Roman" w:cs="Times New Roman"/>
+        </w:rPr>
+        <w:t>Metacritic_Score</w:t>
+      </w:r>
+      <w:proofErr w:type="spellEnd"/>
+      <w:r>
+        <w:rPr>
+          <w:rFonts w:ascii="Times New Roman" w:hAnsi="Times New Roman" w:cs="Times New Roman"/>
+        </w:rPr>
+        <w:t xml:space="preserve"> delimitado estrictamente en el rango cerrado de 0 a 100.</w:t>
+      </w:r>
+    </w:p>
+    <w:p>
+      <w:pPr>
+        <w:rPr>
+          <w:rFonts w:ascii="Times New Roman" w:hAnsi="Times New Roman" w:cs="Times New Roman"/>
+        </w:rPr>
+      </w:pPr>
+    </w:p>
+    <w:p>
+      <w:pPr>
+        <w:numPr>
+          <w:ilvl w:val="1"/>
+          <w:numId w:val="3"/>
+        </w:numPr>
+        <w:rPr>
+          <w:rFonts w:ascii="Times New Roman" w:hAnsi="Times New Roman" w:cs="Times New Roman"/>
+        </w:rPr>
+      </w:pPr>
+      <w:proofErr w:type="spellStart"/>
+      <w:r>
+        <w:rPr>
+          <w:rFonts w:ascii="Times New Roman" w:hAnsi="Times New Roman" w:cs="Times New Roman"/>
+        </w:rPr>
+        <w:t>Tipo_Contenido</w:t>
+      </w:r>
+      <w:proofErr w:type="spellEnd"/>
+      <w:r>
+        <w:rPr>
+          <w:rFonts w:ascii="Times New Roman" w:hAnsi="Times New Roman" w:cs="Times New Roman"/>
+        </w:rPr>
+        <w:t xml:space="preserve"> en DLC limitado a {'Jugable', '</w:t>
+      </w:r>
+      <w:proofErr w:type="spellStart"/>
+      <w:r>
+        <w:rPr>
+          <w:rFonts w:ascii="Times New Roman" w:hAnsi="Times New Roman" w:cs="Times New Roman"/>
+        </w:rPr>
+        <w:t>Banda_Sonora</w:t>
+      </w:r>
+      <w:proofErr w:type="spellEnd"/>
+      <w:r>
+        <w:rPr>
+          <w:rFonts w:ascii="Times New Roman" w:hAnsi="Times New Roman" w:cs="Times New Roman"/>
+        </w:rPr>
+        <w:t xml:space="preserve">', 'Arte'}, con validación condicional estricta para </w:t>
+      </w:r>
+      <w:proofErr w:type="spellStart"/>
+      <w:r>
+        <w:rPr>
+          <w:rFonts w:ascii="Times New Roman" w:hAnsi="Times New Roman" w:cs="Times New Roman"/>
+        </w:rPr>
+        <w:t>Subtipo_Jugable</w:t>
+      </w:r>
+      <w:proofErr w:type="spellEnd"/>
+      <w:r>
+        <w:rPr>
+          <w:rFonts w:ascii="Times New Roman" w:hAnsi="Times New Roman" w:cs="Times New Roman"/>
+        </w:rPr>
+        <w:t xml:space="preserve"> ('Personaje', 'Mapa', '</w:t>
+      </w:r>
+      <w:proofErr w:type="spellStart"/>
+      <w:r>
+        <w:rPr>
+          <w:rFonts w:ascii="Times New Roman" w:hAnsi="Times New Roman" w:cs="Times New Roman"/>
+        </w:rPr>
+        <w:t>Modo_Juego</w:t>
+      </w:r>
+      <w:proofErr w:type="spellEnd"/>
+      <w:r>
+        <w:rPr>
+          <w:rFonts w:ascii="Times New Roman" w:hAnsi="Times New Roman" w:cs="Times New Roman"/>
+        </w:rPr>
+        <w:t>', '</w:t>
+      </w:r>
+      <w:proofErr w:type="spellStart"/>
+      <w:r>
+        <w:rPr>
+          <w:rFonts w:ascii="Times New Roman" w:hAnsi="Times New Roman" w:cs="Times New Roman"/>
+        </w:rPr>
+        <w:t>Cosmetico</w:t>
+      </w:r>
+      <w:proofErr w:type="spellEnd"/>
+      <w:r>
+        <w:rPr>
+          <w:rFonts w:ascii="Times New Roman" w:hAnsi="Times New Roman" w:cs="Times New Roman"/>
+        </w:rPr>
+        <w:t>'), permitiendo valores solo cuando el contenido es jugable.</w:t>
+      </w:r>
+    </w:p>
+    <w:p>
+      <w:pPr>
+        <w:rPr>
+          <w:rFonts w:ascii="Times New Roman" w:hAnsi="Times New Roman" w:cs="Times New Roman"/>
+        </w:rPr>
+      </w:pPr>
+    </w:p>
+    <w:p>
+      <w:pPr>
+        <w:numPr>
+          <w:ilvl w:val="1"/>
+          <w:numId w:val="3"/>
+        </w:numPr>
+        <w:rPr>
+          <w:rFonts w:ascii="Times New Roman" w:hAnsi="Times New Roman" w:cs="Times New Roman"/>
+        </w:rPr>
+      </w:pPr>
+      <w:proofErr w:type="spellStart"/>
+      <w:r>
+        <w:rPr>
+          <w:rFonts w:ascii="Times New Roman" w:hAnsi="Times New Roman" w:cs="Times New Roman"/>
+        </w:rPr>
+        <w:t>Estado_Cuenta</w:t>
+      </w:r>
+      <w:proofErr w:type="spellEnd"/>
+      <w:r>
+        <w:rPr>
+          <w:rFonts w:ascii="Times New Roman" w:hAnsi="Times New Roman" w:cs="Times New Roman"/>
+        </w:rPr>
+        <w:t xml:space="preserve"> de usuario limitado a {'Activa', 'Suspendida', 'Baneada'} y </w:t>
+      </w:r>
+      <w:proofErr w:type="spellStart"/>
+      <w:r>
+        <w:rPr>
+          <w:rFonts w:ascii="Times New Roman" w:hAnsi="Times New Roman" w:cs="Times New Roman"/>
+        </w:rPr>
+        <w:t>Estado_Amistad</w:t>
+      </w:r>
+      <w:proofErr w:type="spellEnd"/>
+      <w:r>
+        <w:rPr>
+          <w:rFonts w:ascii="Times New Roman" w:hAnsi="Times New Roman" w:cs="Times New Roman"/>
+        </w:rPr>
+        <w:t xml:space="preserve"> a {'Pendiente', 'Aceptada', 'Bloqueada'}.</w:t>
+      </w:r>
+    </w:p>
+    <w:p>
+      <w:pPr>
+        <w:rPr>
+          <w:rFonts w:ascii="Times New Roman" w:hAnsi="Times New Roman" w:cs="Times New Roman"/>
+        </w:rPr>
+      </w:pPr>
+    </w:p>
+    <w:p>
+      <w:pPr>
+        <w:numPr>
+          <w:ilvl w:val="1"/>
+          <w:numId w:val="3"/>
+        </w:numPr>
+        <w:rPr>
+          <w:rFonts w:ascii="Times New Roman" w:hAnsi="Times New Roman" w:cs="Times New Roman"/>
+        </w:rPr>
+      </w:pPr>
+      <w:r>
+        <w:rPr>
+          <w:rFonts w:ascii="Times New Roman" w:hAnsi="Times New Roman" w:cs="Times New Roman"/>
+        </w:rPr>
+        <w:t>Porcentaje de descuento acotado entre 0 y 100, con consistencia cronológica obligatoria (</w:t>
+      </w:r>
+      <w:proofErr w:type="spellStart"/>
+      <w:r>
+        <w:rPr>
+          <w:rFonts w:ascii="Times New Roman" w:hAnsi="Times New Roman" w:cs="Times New Roman"/>
+        </w:rPr>
+        <w:t>Fecha_Fin</w:t>
+      </w:r>
+      <w:proofErr w:type="spellEnd"/>
+      <w:r>
+        <w:rPr>
+          <w:rFonts w:ascii="Times New Roman" w:hAnsi="Times New Roman" w:cs="Times New Roman"/>
+        </w:rPr>
+        <w:t xml:space="preserve"> &gt;= </w:t>
+      </w:r>
+      <w:proofErr w:type="spellStart"/>
+      <w:r>
+        <w:rPr>
+          <w:rFonts w:ascii="Times New Roman" w:hAnsi="Times New Roman" w:cs="Times New Roman"/>
+        </w:rPr>
+        <w:t>Fecha_Inicio</w:t>
+      </w:r>
+      <w:proofErr w:type="spellEnd"/>
+      <w:r>
+        <w:rPr>
+          <w:rFonts w:ascii="Times New Roman" w:hAnsi="Times New Roman" w:cs="Times New Roman"/>
+        </w:rPr>
+        <w:t>).</w:t>
+      </w:r>
+    </w:p>
+    <w:p>
+      <w:pPr>
+        <w:rPr>
+          <w:rFonts w:ascii="Times New Roman" w:hAnsi="Times New Roman" w:cs="Times New Roman"/>
+        </w:rPr>
+      </w:pPr>
+    </w:p>
+    <w:p>
+      <w:pPr>
+        <w:rPr>
+          <w:rFonts w:ascii="Times New Roman" w:hAnsi="Times New Roman" w:cs="Times New Roman"/>
+          <w:b/>
+          <w:bCs/>
+        </w:rPr>
+      </w:pPr>
+      <w:r>
+        <w:rPr>
+          <w:rFonts w:ascii="Times New Roman" w:hAnsi="Times New Roman" w:cs="Times New Roman"/>
+          <w:b/>
+          <w:bCs/>
+        </w:rPr>
+        <w:t>C. Consistencia Histórica y Precios Congelados</w:t>
+      </w:r>
+    </w:p>
+    <w:p>
+      <w:pPr>
+        <w:numPr>
+          <w:ilvl w:val="0"/>
+          <w:numId w:val="4"/>
+        </w:numPr>
+        <w:rPr>
+          <w:rFonts w:ascii="Times New Roman" w:hAnsi="Times New Roman" w:cs="Times New Roman"/>
+        </w:rPr>
+      </w:pPr>
+      <w:r>
+        <w:rPr>
+          <w:rFonts w:ascii="Times New Roman" w:hAnsi="Times New Roman" w:cs="Times New Roman"/>
+        </w:rPr>
+        <w:t xml:space="preserve">Para preservar la auditoría financiera ante modificaciones futuras del catálogo, se asume el uso de </w:t>
+      </w:r>
+      <w:r>
+        <w:rPr>
+          <w:rFonts w:ascii="Times New Roman" w:hAnsi="Times New Roman" w:cs="Times New Roman"/>
+          <w:b/>
+          <w:bCs/>
+        </w:rPr>
+        <w:t>precios congelados</w:t>
+      </w:r>
+      <w:r>
+        <w:rPr>
+          <w:rFonts w:ascii="Times New Roman" w:hAnsi="Times New Roman" w:cs="Times New Roman"/>
+        </w:rPr>
+        <w:t>:</w:t>
+      </w:r>
+    </w:p>
+    <w:p>
+      <w:pPr>
+        <w:rPr>
+          <w:rFonts w:ascii="Times New Roman" w:hAnsi="Times New Roman" w:cs="Times New Roman"/>
+        </w:rPr>
+      </w:pPr>
+      <w:r>
+        <w:rPr>
+          <w:rFonts w:ascii="Times New Roman" w:hAnsi="Times New Roman" w:cs="Times New Roman"/>
+        </w:rPr>
+        <w:br/>
+      </w:r>
+    </w:p>
+    <w:p>
+      <w:pPr>
+        <w:numPr>
+          <w:ilvl w:val="1"/>
+          <w:numId w:val="4"/>
+        </w:numPr>
+        <w:rPr>
+          <w:rFonts w:ascii="Times New Roman" w:hAnsi="Times New Roman" w:cs="Times New Roman"/>
+        </w:rPr>
+      </w:pPr>
+      <w:proofErr w:type="spellStart"/>
+      <w:r>
+        <w:rPr>
+          <w:rFonts w:ascii="Times New Roman" w:hAnsi="Times New Roman" w:cs="Times New Roman"/>
+        </w:rPr>
+        <w:t>Precio_Base_En_Evento</w:t>
+      </w:r>
+      <w:proofErr w:type="spellEnd"/>
+      <w:r>
+        <w:rPr>
+          <w:rFonts w:ascii="Times New Roman" w:hAnsi="Times New Roman" w:cs="Times New Roman"/>
+        </w:rPr>
+        <w:t xml:space="preserve"> en la tabla </w:t>
+      </w:r>
+      <w:proofErr w:type="spellStart"/>
+      <w:r>
+        <w:rPr>
+          <w:rFonts w:ascii="Times New Roman" w:hAnsi="Times New Roman" w:cs="Times New Roman"/>
+        </w:rPr>
+        <w:t>Historial_Descuento</w:t>
+      </w:r>
+      <w:proofErr w:type="spellEnd"/>
+      <w:r>
+        <w:rPr>
+          <w:rFonts w:ascii="Times New Roman" w:hAnsi="Times New Roman" w:cs="Times New Roman"/>
+        </w:rPr>
+        <w:t xml:space="preserve"> almacena el precio de referencia al iniciar la oferta.</w:t>
+      </w:r>
+    </w:p>
+    <w:p>
+      <w:pPr>
+        <w:rPr>
+          <w:rFonts w:ascii="Times New Roman" w:hAnsi="Times New Roman" w:cs="Times New Roman"/>
+        </w:rPr>
+      </w:pPr>
+    </w:p>
+    <w:p>
+      <w:pPr>
+        <w:numPr>
+          <w:ilvl w:val="1"/>
+          <w:numId w:val="4"/>
+        </w:numPr>
+        <w:rPr>
+          <w:rFonts w:ascii="Times New Roman" w:hAnsi="Times New Roman" w:cs="Times New Roman"/>
+        </w:rPr>
+      </w:pPr>
+      <w:proofErr w:type="spellStart"/>
+      <w:r>
+        <w:rPr>
+          <w:rFonts w:ascii="Times New Roman" w:hAnsi="Times New Roman" w:cs="Times New Roman"/>
+        </w:rPr>
+        <w:t>Precio_Venta_Historico</w:t>
+      </w:r>
+      <w:proofErr w:type="spellEnd"/>
+      <w:r>
+        <w:rPr>
+          <w:rFonts w:ascii="Times New Roman" w:hAnsi="Times New Roman" w:cs="Times New Roman"/>
+        </w:rPr>
+        <w:t xml:space="preserve"> y </w:t>
+      </w:r>
+      <w:proofErr w:type="spellStart"/>
+      <w:r>
+        <w:rPr>
+          <w:rFonts w:ascii="Times New Roman" w:hAnsi="Times New Roman" w:cs="Times New Roman"/>
+        </w:rPr>
+        <w:t>Descuento_Aplicado_Pct</w:t>
+      </w:r>
+      <w:proofErr w:type="spellEnd"/>
+      <w:r>
+        <w:rPr>
+          <w:rFonts w:ascii="Times New Roman" w:hAnsi="Times New Roman" w:cs="Times New Roman"/>
+        </w:rPr>
+        <w:t xml:space="preserve"> en la tabla </w:t>
+      </w:r>
+      <w:proofErr w:type="spellStart"/>
+      <w:r>
+        <w:rPr>
+          <w:rFonts w:ascii="Times New Roman" w:hAnsi="Times New Roman" w:cs="Times New Roman"/>
+        </w:rPr>
+        <w:t>Detalle_Factura</w:t>
+      </w:r>
+      <w:proofErr w:type="spellEnd"/>
+      <w:r>
+        <w:rPr>
+          <w:rFonts w:ascii="Times New Roman" w:hAnsi="Times New Roman" w:cs="Times New Roman"/>
+        </w:rPr>
+        <w:t xml:space="preserve"> registran exactamente las condiciones comerciales vigentes al momento de ejecutar la compra.</w:t>
+      </w:r>
+    </w:p>
+    <w:p>
+      <w:pPr>
+        <w:rPr>
+          <w:rFonts w:ascii="Times New Roman" w:hAnsi="Times New Roman" w:cs="Times New Roman"/>
+        </w:rPr>
+      </w:pPr>
+    </w:p>
+    <w:p>
+      <w:pPr>
+        <w:rPr>
+          <w:rFonts w:ascii="Times New Roman" w:hAnsi="Times New Roman" w:cs="Times New Roman"/>
+          <w:b/>
+          <w:bCs/>
+        </w:rPr>
+      </w:pPr>
+      <w:r>
+        <w:rPr>
+          <w:rFonts w:ascii="Times New Roman" w:hAnsi="Times New Roman" w:cs="Times New Roman"/>
+          <w:b/>
+          <w:bCs/>
+        </w:rPr>
+        <w:t>3. Orden de Ejecución de los Scripts</w:t>
+      </w:r>
+    </w:p>
+    <w:p>
+      <w:pPr>
+        <w:rPr>
+          <w:rFonts w:ascii="Times New Roman" w:hAnsi="Times New Roman" w:cs="Times New Roman"/>
+        </w:rPr>
+      </w:pPr>
+      <w:r>
+        <w:rPr>
+          <w:rFonts w:ascii="Times New Roman" w:hAnsi="Times New Roman" w:cs="Times New Roman"/>
+        </w:rPr>
+        <w:t>Para garantizar el cumplimiento de las dependencias de claves foráneas y la correcta creación de los objetos de base de datos, los scripts SQL deben ejecutarse en el siguiente orden secuencial estricto:</w:t>
+      </w:r>
+    </w:p>
+    <w:p>
+      <w:pPr>
+        <w:rPr>
+          <w:rFonts w:ascii="Times New Roman" w:hAnsi="Times New Roman" w:cs="Times New Roman"/>
+        </w:rPr>
+      </w:pPr>
+      <w:r>
+        <w:rPr>
+          <w:rFonts w:ascii="Times New Roman" w:hAnsi="Times New Roman" w:cs="Times New Roman"/>
+        </w:rPr>
+        <w:br/>
+      </w:r>
+    </w:p>
+    <w:p>
+      <w:pPr>
+        <w:rPr>
+          <w:rFonts w:ascii="Times New Roman" w:hAnsi="Times New Roman" w:cs="Times New Roman"/>
+          <w:b/>
+          <w:bCs/>
+        </w:rPr>
+      </w:pPr>
+      <w:r>
+        <w:rPr>
+          <w:rFonts w:ascii="Times New Roman" w:hAnsi="Times New Roman" w:cs="Times New Roman"/>
+          <w:b/>
+          <w:bCs/>
+        </w:rPr>
+        <w:t xml:space="preserve">1. </w:t>
+      </w:r>
+      <w:proofErr w:type="spellStart"/>
+      <w:r>
+        <w:rPr>
+          <w:rFonts w:ascii="Times New Roman" w:hAnsi="Times New Roman" w:cs="Times New Roman"/>
+        </w:rPr>
+        <w:t>DDL.sql</w:t>
+      </w:r>
+      <w:proofErr w:type="spellEnd"/>
+      <w:r>
+        <w:rPr>
+          <w:rFonts w:ascii="Times New Roman" w:hAnsi="Times New Roman" w:cs="Times New Roman"/>
+          <w:b/>
+          <w:bCs/>
+        </w:rPr>
+        <w:t xml:space="preserve"> (Creación de Estructuras y Tablas)</w:t>
+      </w:r>
+    </w:p>
+    <w:p>
+      <w:pPr>
+        <w:numPr>
+          <w:ilvl w:val="0"/>
+          <w:numId w:val="5"/>
+        </w:numPr>
+        <w:rPr>
+          <w:rFonts w:ascii="Times New Roman" w:hAnsi="Times New Roman" w:cs="Times New Roman"/>
+        </w:rPr>
+      </w:pPr>
+      <w:r>
+        <w:rPr>
+          <w:rFonts w:ascii="Times New Roman" w:hAnsi="Times New Roman" w:cs="Times New Roman"/>
+          <w:b/>
+          <w:bCs/>
+        </w:rPr>
+        <w:t>Propósito:</w:t>
+      </w:r>
+      <w:r>
+        <w:rPr>
+          <w:rFonts w:ascii="Times New Roman" w:hAnsi="Times New Roman" w:cs="Times New Roman"/>
+        </w:rPr>
+        <w:t xml:space="preserve"> Creación de la base de datos y definición de todas las tablas con sus respectivas llaves primarias, llaves foráneas y restricciones CHECK.</w:t>
+      </w:r>
+    </w:p>
+    <w:p>
+      <w:pPr>
+        <w:rPr>
+          <w:rFonts w:ascii="Times New Roman" w:hAnsi="Times New Roman" w:cs="Times New Roman"/>
+        </w:rPr>
+      </w:pPr>
+    </w:p>
+    <w:p>
+      <w:pPr>
+        <w:numPr>
+          <w:ilvl w:val="0"/>
+          <w:numId w:val="5"/>
+        </w:numPr>
+        <w:rPr>
+          <w:rFonts w:ascii="Times New Roman" w:hAnsi="Times New Roman" w:cs="Times New Roman"/>
+        </w:rPr>
+      </w:pPr>
+      <w:r>
+        <w:rPr>
+          <w:rFonts w:ascii="Times New Roman" w:hAnsi="Times New Roman" w:cs="Times New Roman"/>
+          <w:b/>
+          <w:bCs/>
+        </w:rPr>
+        <w:t>Orden lógico interno de creación:</w:t>
+      </w:r>
+    </w:p>
+    <w:p>
+      <w:pPr>
+        <w:rPr>
+          <w:rFonts w:ascii="Times New Roman" w:hAnsi="Times New Roman" w:cs="Times New Roman"/>
+        </w:rPr>
+      </w:pPr>
+      <w:r>
+        <w:rPr>
+          <w:rFonts w:ascii="Times New Roman" w:hAnsi="Times New Roman" w:cs="Times New Roman"/>
+        </w:rPr>
+        <w:br/>
+      </w:r>
+    </w:p>
+    <w:p>
+      <w:pPr>
+        <w:numPr>
+          <w:ilvl w:val="1"/>
+          <w:numId w:val="5"/>
+        </w:numPr>
+        <w:rPr>
+          <w:rFonts w:ascii="Times New Roman" w:hAnsi="Times New Roman" w:cs="Times New Roman"/>
+        </w:rPr>
+      </w:pPr>
+      <w:r>
+        <w:rPr>
+          <w:rFonts w:ascii="Times New Roman" w:hAnsi="Times New Roman" w:cs="Times New Roman"/>
+        </w:rPr>
+        <w:t xml:space="preserve">Tablas maestras independientes sin dependencias foráneas: </w:t>
+      </w:r>
+      <w:proofErr w:type="spellStart"/>
+      <w:r>
+        <w:rPr>
+          <w:rFonts w:ascii="Times New Roman" w:hAnsi="Times New Roman" w:cs="Times New Roman"/>
+        </w:rPr>
+        <w:t>Empresa_Corporativa</w:t>
+      </w:r>
+      <w:proofErr w:type="spellEnd"/>
+      <w:r>
+        <w:rPr>
+          <w:rFonts w:ascii="Times New Roman" w:hAnsi="Times New Roman" w:cs="Times New Roman"/>
+        </w:rPr>
+        <w:t xml:space="preserve">, </w:t>
+      </w:r>
+      <w:proofErr w:type="spellStart"/>
+      <w:r>
+        <w:rPr>
+          <w:rFonts w:ascii="Times New Roman" w:hAnsi="Times New Roman" w:cs="Times New Roman"/>
+        </w:rPr>
+        <w:t>Categoria_Oficial</w:t>
+      </w:r>
+      <w:proofErr w:type="spellEnd"/>
+      <w:r>
+        <w:rPr>
+          <w:rFonts w:ascii="Times New Roman" w:hAnsi="Times New Roman" w:cs="Times New Roman"/>
+        </w:rPr>
+        <w:t xml:space="preserve">, Idioma, </w:t>
+      </w:r>
+      <w:proofErr w:type="spellStart"/>
+      <w:r>
+        <w:rPr>
+          <w:rFonts w:ascii="Times New Roman" w:hAnsi="Times New Roman" w:cs="Times New Roman"/>
+        </w:rPr>
+        <w:t>Etiqueta_Comunidad</w:t>
+      </w:r>
+      <w:proofErr w:type="spellEnd"/>
+      <w:r>
+        <w:rPr>
+          <w:rFonts w:ascii="Times New Roman" w:hAnsi="Times New Roman" w:cs="Times New Roman"/>
+        </w:rPr>
+        <w:t xml:space="preserve">, </w:t>
+      </w:r>
+      <w:proofErr w:type="spellStart"/>
+      <w:r>
+        <w:rPr>
+          <w:rFonts w:ascii="Times New Roman" w:hAnsi="Times New Roman" w:cs="Times New Roman"/>
+        </w:rPr>
+        <w:t>Metodo_Pago</w:t>
+      </w:r>
+      <w:proofErr w:type="spellEnd"/>
+      <w:r>
+        <w:rPr>
+          <w:rFonts w:ascii="Times New Roman" w:hAnsi="Times New Roman" w:cs="Times New Roman"/>
+        </w:rPr>
+        <w:t>, Usuario.</w:t>
+      </w:r>
+    </w:p>
+    <w:p>
+      <w:pPr>
+        <w:rPr>
+          <w:rFonts w:ascii="Times New Roman" w:hAnsi="Times New Roman" w:cs="Times New Roman"/>
+        </w:rPr>
+      </w:pPr>
+    </w:p>
+    <w:p>
+      <w:pPr>
+        <w:numPr>
+          <w:ilvl w:val="1"/>
+          <w:numId w:val="5"/>
+        </w:numPr>
+        <w:rPr>
+          <w:rFonts w:ascii="Times New Roman" w:hAnsi="Times New Roman" w:cs="Times New Roman"/>
+        </w:rPr>
+      </w:pPr>
+      <w:r>
+        <w:rPr>
+          <w:rFonts w:ascii="Times New Roman" w:hAnsi="Times New Roman" w:cs="Times New Roman"/>
+        </w:rPr>
+        <w:t xml:space="preserve">Tablas principales de catálogo: </w:t>
+      </w:r>
+      <w:proofErr w:type="spellStart"/>
+      <w:r>
+        <w:rPr>
+          <w:rFonts w:ascii="Times New Roman" w:hAnsi="Times New Roman" w:cs="Times New Roman"/>
+        </w:rPr>
+        <w:t>Producto_Digital</w:t>
+      </w:r>
+      <w:proofErr w:type="spellEnd"/>
+      <w:r>
+        <w:rPr>
+          <w:rFonts w:ascii="Times New Roman" w:hAnsi="Times New Roman" w:cs="Times New Roman"/>
+        </w:rPr>
+        <w:t>.</w:t>
+      </w:r>
+    </w:p>
+    <w:p>
+      <w:pPr>
+        <w:rPr>
+          <w:rFonts w:ascii="Times New Roman" w:hAnsi="Times New Roman" w:cs="Times New Roman"/>
+        </w:rPr>
+      </w:pPr>
+    </w:p>
+    <w:p>
+      <w:pPr>
+        <w:numPr>
+          <w:ilvl w:val="1"/>
+          <w:numId w:val="5"/>
+        </w:numPr>
+        <w:rPr>
+          <w:rFonts w:ascii="Times New Roman" w:hAnsi="Times New Roman" w:cs="Times New Roman"/>
+        </w:rPr>
+      </w:pPr>
+      <w:r>
+        <w:rPr>
+          <w:rFonts w:ascii="Times New Roman" w:hAnsi="Times New Roman" w:cs="Times New Roman"/>
+        </w:rPr>
+        <w:lastRenderedPageBreak/>
+        <w:t xml:space="preserve">Subtablas y entidades dependientes de nivel 1: </w:t>
+      </w:r>
+      <w:proofErr w:type="spellStart"/>
+      <w:r>
+        <w:rPr>
+          <w:rFonts w:ascii="Times New Roman" w:hAnsi="Times New Roman" w:cs="Times New Roman"/>
+        </w:rPr>
+        <w:t>Juego_Base</w:t>
+      </w:r>
+      <w:proofErr w:type="spellEnd"/>
+      <w:r>
+        <w:rPr>
+          <w:rFonts w:ascii="Times New Roman" w:hAnsi="Times New Roman" w:cs="Times New Roman"/>
+        </w:rPr>
+        <w:t xml:space="preserve">, </w:t>
+      </w:r>
+      <w:proofErr w:type="spellStart"/>
+      <w:r>
+        <w:rPr>
+          <w:rFonts w:ascii="Times New Roman" w:hAnsi="Times New Roman" w:cs="Times New Roman"/>
+        </w:rPr>
+        <w:t>Galeria_Multimedia</w:t>
+      </w:r>
+      <w:proofErr w:type="spellEnd"/>
+      <w:r>
+        <w:rPr>
+          <w:rFonts w:ascii="Times New Roman" w:hAnsi="Times New Roman" w:cs="Times New Roman"/>
+        </w:rPr>
+        <w:t xml:space="preserve">, </w:t>
+      </w:r>
+      <w:proofErr w:type="spellStart"/>
+      <w:r>
+        <w:rPr>
+          <w:rFonts w:ascii="Times New Roman" w:hAnsi="Times New Roman" w:cs="Times New Roman"/>
+        </w:rPr>
+        <w:t>Perfil_Requisito</w:t>
+      </w:r>
+      <w:proofErr w:type="spellEnd"/>
+      <w:r>
+        <w:rPr>
+          <w:rFonts w:ascii="Times New Roman" w:hAnsi="Times New Roman" w:cs="Times New Roman"/>
+        </w:rPr>
+        <w:t xml:space="preserve">, Logro, </w:t>
+      </w:r>
+      <w:proofErr w:type="spellStart"/>
+      <w:r>
+        <w:rPr>
+          <w:rFonts w:ascii="Times New Roman" w:hAnsi="Times New Roman" w:cs="Times New Roman"/>
+        </w:rPr>
+        <w:t>Juego_Categoria</w:t>
+      </w:r>
+      <w:proofErr w:type="spellEnd"/>
+      <w:r>
+        <w:rPr>
+          <w:rFonts w:ascii="Times New Roman" w:hAnsi="Times New Roman" w:cs="Times New Roman"/>
+        </w:rPr>
+        <w:t xml:space="preserve">, </w:t>
+      </w:r>
+      <w:proofErr w:type="spellStart"/>
+      <w:r>
+        <w:rPr>
+          <w:rFonts w:ascii="Times New Roman" w:hAnsi="Times New Roman" w:cs="Times New Roman"/>
+        </w:rPr>
+        <w:t>Soporte_Idioma</w:t>
+      </w:r>
+      <w:proofErr w:type="spellEnd"/>
+      <w:r>
+        <w:rPr>
+          <w:rFonts w:ascii="Times New Roman" w:hAnsi="Times New Roman" w:cs="Times New Roman"/>
+        </w:rPr>
+        <w:t xml:space="preserve">, </w:t>
+      </w:r>
+      <w:proofErr w:type="spellStart"/>
+      <w:r>
+        <w:rPr>
+          <w:rFonts w:ascii="Times New Roman" w:hAnsi="Times New Roman" w:cs="Times New Roman"/>
+        </w:rPr>
+        <w:t>Producto_Etiqueta</w:t>
+      </w:r>
+      <w:proofErr w:type="spellEnd"/>
+      <w:r>
+        <w:rPr>
+          <w:rFonts w:ascii="Times New Roman" w:hAnsi="Times New Roman" w:cs="Times New Roman"/>
+        </w:rPr>
+        <w:t xml:space="preserve">, Mod, </w:t>
+      </w:r>
+      <w:proofErr w:type="spellStart"/>
+      <w:r>
+        <w:rPr>
+          <w:rFonts w:ascii="Times New Roman" w:hAnsi="Times New Roman" w:cs="Times New Roman"/>
+        </w:rPr>
+        <w:t>Amistad_Usuario</w:t>
+      </w:r>
+      <w:proofErr w:type="spellEnd"/>
+      <w:r>
+        <w:rPr>
+          <w:rFonts w:ascii="Times New Roman" w:hAnsi="Times New Roman" w:cs="Times New Roman"/>
+        </w:rPr>
+        <w:t xml:space="preserve">, Biblioteca, </w:t>
+      </w:r>
+      <w:proofErr w:type="spellStart"/>
+      <w:r>
+        <w:rPr>
+          <w:rFonts w:ascii="Times New Roman" w:hAnsi="Times New Roman" w:cs="Times New Roman"/>
+        </w:rPr>
+        <w:t>Lista_Deseos</w:t>
+      </w:r>
+      <w:proofErr w:type="spellEnd"/>
+      <w:r>
+        <w:rPr>
+          <w:rFonts w:ascii="Times New Roman" w:hAnsi="Times New Roman" w:cs="Times New Roman"/>
+        </w:rPr>
+        <w:t xml:space="preserve">, Carrito, </w:t>
+      </w:r>
+      <w:proofErr w:type="spellStart"/>
+      <w:r>
+        <w:rPr>
+          <w:rFonts w:ascii="Times New Roman" w:hAnsi="Times New Roman" w:cs="Times New Roman"/>
+        </w:rPr>
+        <w:t>Resena</w:t>
+      </w:r>
+      <w:proofErr w:type="spellEnd"/>
+      <w:r>
+        <w:rPr>
+          <w:rFonts w:ascii="Times New Roman" w:hAnsi="Times New Roman" w:cs="Times New Roman"/>
+        </w:rPr>
+        <w:t xml:space="preserve">, </w:t>
+      </w:r>
+      <w:proofErr w:type="spellStart"/>
+      <w:r>
+        <w:rPr>
+          <w:rFonts w:ascii="Times New Roman" w:hAnsi="Times New Roman" w:cs="Times New Roman"/>
+        </w:rPr>
+        <w:t>Historial_Descuento</w:t>
+      </w:r>
+      <w:proofErr w:type="spellEnd"/>
+      <w:r>
+        <w:rPr>
+          <w:rFonts w:ascii="Times New Roman" w:hAnsi="Times New Roman" w:cs="Times New Roman"/>
+        </w:rPr>
+        <w:t xml:space="preserve">, </w:t>
+      </w:r>
+      <w:proofErr w:type="spellStart"/>
+      <w:r>
+        <w:rPr>
+          <w:rFonts w:ascii="Times New Roman" w:hAnsi="Times New Roman" w:cs="Times New Roman"/>
+        </w:rPr>
+        <w:t>Registro_Concurrencia</w:t>
+      </w:r>
+      <w:proofErr w:type="spellEnd"/>
+      <w:r>
+        <w:rPr>
+          <w:rFonts w:ascii="Times New Roman" w:hAnsi="Times New Roman" w:cs="Times New Roman"/>
+        </w:rPr>
+        <w:t>.</w:t>
+      </w:r>
+    </w:p>
+    <w:p>
+      <w:pPr>
+        <w:rPr>
+          <w:rFonts w:ascii="Times New Roman" w:hAnsi="Times New Roman" w:cs="Times New Roman"/>
+        </w:rPr>
+      </w:pPr>
+    </w:p>
+    <w:p>
+      <w:pPr>
+        <w:numPr>
+          <w:ilvl w:val="1"/>
+          <w:numId w:val="5"/>
+        </w:numPr>
+        <w:rPr>
+          <w:rFonts w:ascii="Times New Roman" w:hAnsi="Times New Roman" w:cs="Times New Roman"/>
+        </w:rPr>
+      </w:pPr>
+      <w:r>
+        <w:rPr>
+          <w:rFonts w:ascii="Times New Roman" w:hAnsi="Times New Roman" w:cs="Times New Roman"/>
+        </w:rPr>
+        <w:t xml:space="preserve">Tablas dependientes de nivel 2 y transaccionales: DLC (depende de </w:t>
+      </w:r>
+      <w:proofErr w:type="spellStart"/>
+      <w:r>
+        <w:rPr>
+          <w:rFonts w:ascii="Times New Roman" w:hAnsi="Times New Roman" w:cs="Times New Roman"/>
+        </w:rPr>
+        <w:t>Juego_Base</w:t>
+      </w:r>
+      <w:proofErr w:type="spellEnd"/>
+      <w:r>
+        <w:rPr>
+          <w:rFonts w:ascii="Times New Roman" w:hAnsi="Times New Roman" w:cs="Times New Roman"/>
+        </w:rPr>
+        <w:t xml:space="preserve">), </w:t>
+      </w:r>
+      <w:proofErr w:type="spellStart"/>
+      <w:r>
+        <w:rPr>
+          <w:rFonts w:ascii="Times New Roman" w:hAnsi="Times New Roman" w:cs="Times New Roman"/>
+        </w:rPr>
+        <w:t>Suscripcion_Mod</w:t>
+      </w:r>
+      <w:proofErr w:type="spellEnd"/>
+      <w:r>
+        <w:rPr>
+          <w:rFonts w:ascii="Times New Roman" w:hAnsi="Times New Roman" w:cs="Times New Roman"/>
+        </w:rPr>
+        <w:t xml:space="preserve"> (depende de Mod), </w:t>
+      </w:r>
+      <w:proofErr w:type="spellStart"/>
+      <w:r>
+        <w:rPr>
+          <w:rFonts w:ascii="Times New Roman" w:hAnsi="Times New Roman" w:cs="Times New Roman"/>
+        </w:rPr>
+        <w:t>Desbloqueo_Logro</w:t>
+      </w:r>
+      <w:proofErr w:type="spellEnd"/>
+      <w:r>
+        <w:rPr>
+          <w:rFonts w:ascii="Times New Roman" w:hAnsi="Times New Roman" w:cs="Times New Roman"/>
+        </w:rPr>
+        <w:t xml:space="preserve"> (depende de Logro), Factura (depende de Usuario y </w:t>
+      </w:r>
+      <w:proofErr w:type="spellStart"/>
+      <w:r>
+        <w:rPr>
+          <w:rFonts w:ascii="Times New Roman" w:hAnsi="Times New Roman" w:cs="Times New Roman"/>
+        </w:rPr>
+        <w:t>Metodo_Pago</w:t>
+      </w:r>
+      <w:proofErr w:type="spellEnd"/>
+      <w:r>
+        <w:rPr>
+          <w:rFonts w:ascii="Times New Roman" w:hAnsi="Times New Roman" w:cs="Times New Roman"/>
+        </w:rPr>
+        <w:t xml:space="preserve">), </w:t>
+      </w:r>
+      <w:proofErr w:type="spellStart"/>
+      <w:r>
+        <w:rPr>
+          <w:rFonts w:ascii="Times New Roman" w:hAnsi="Times New Roman" w:cs="Times New Roman"/>
+        </w:rPr>
+        <w:t>Detalle_Factura</w:t>
+      </w:r>
+      <w:proofErr w:type="spellEnd"/>
+      <w:r>
+        <w:rPr>
+          <w:rFonts w:ascii="Times New Roman" w:hAnsi="Times New Roman" w:cs="Times New Roman"/>
+        </w:rPr>
+        <w:t xml:space="preserve"> (depende de Factura y </w:t>
+      </w:r>
+      <w:proofErr w:type="spellStart"/>
+      <w:r>
+        <w:rPr>
+          <w:rFonts w:ascii="Times New Roman" w:hAnsi="Times New Roman" w:cs="Times New Roman"/>
+        </w:rPr>
+        <w:t>Producto_Digital</w:t>
+      </w:r>
+      <w:proofErr w:type="spellEnd"/>
+      <w:r>
+        <w:rPr>
+          <w:rFonts w:ascii="Times New Roman" w:hAnsi="Times New Roman" w:cs="Times New Roman"/>
+        </w:rPr>
+        <w:t xml:space="preserve">), Reembolso (depende de Factura y </w:t>
+      </w:r>
+      <w:proofErr w:type="spellStart"/>
+      <w:r>
+        <w:rPr>
+          <w:rFonts w:ascii="Times New Roman" w:hAnsi="Times New Roman" w:cs="Times New Roman"/>
+        </w:rPr>
+        <w:t>Producto_Digital</w:t>
+      </w:r>
+      <w:proofErr w:type="spellEnd"/>
+      <w:r>
+        <w:rPr>
+          <w:rFonts w:ascii="Times New Roman" w:hAnsi="Times New Roman" w:cs="Times New Roman"/>
+        </w:rPr>
+        <w:t>).</w:t>
+      </w:r>
+    </w:p>
+    <w:p>
+      <w:pPr>
+        <w:rPr>
+          <w:rFonts w:ascii="Times New Roman" w:hAnsi="Times New Roman" w:cs="Times New Roman"/>
+        </w:rPr>
+      </w:pPr>
+    </w:p>
+    <w:p>
+      <w:pPr>
+        <w:rPr>
+          <w:rFonts w:ascii="Times New Roman" w:hAnsi="Times New Roman" w:cs="Times New Roman"/>
+          <w:b/>
+          <w:bCs/>
+        </w:rPr>
+      </w:pPr>
+      <w:r>
+        <w:rPr>
+          <w:rFonts w:ascii="Times New Roman" w:hAnsi="Times New Roman" w:cs="Times New Roman"/>
+          <w:b/>
+          <w:bCs/>
+        </w:rPr>
+        <w:t xml:space="preserve">2. </w:t>
+      </w:r>
+      <w:proofErr w:type="spellStart"/>
+      <w:r>
+        <w:rPr>
+          <w:rFonts w:ascii="Times New Roman" w:hAnsi="Times New Roman" w:cs="Times New Roman"/>
+        </w:rPr>
+        <w:t>Inserts.sql</w:t>
+      </w:r>
+      <w:proofErr w:type="spellEnd"/>
+      <w:r>
+        <w:rPr>
+          <w:rFonts w:ascii="Times New Roman" w:hAnsi="Times New Roman" w:cs="Times New Roman"/>
+          <w:b/>
+          <w:bCs/>
+        </w:rPr>
+        <w:t xml:space="preserve"> (Carga Masiva de Datos / Data </w:t>
+      </w:r>
+      <w:proofErr w:type="spellStart"/>
+      <w:r>
+        <w:rPr>
+          <w:rFonts w:ascii="Times New Roman" w:hAnsi="Times New Roman" w:cs="Times New Roman"/>
+          <w:b/>
+          <w:bCs/>
+        </w:rPr>
+        <w:t>Seeding</w:t>
+      </w:r>
+      <w:proofErr w:type="spellEnd"/>
+      <w:r>
+        <w:rPr>
+          <w:rFonts w:ascii="Times New Roman" w:hAnsi="Times New Roman" w:cs="Times New Roman"/>
+          <w:b/>
+          <w:bCs/>
+        </w:rPr>
+        <w:t>)</w:t>
+      </w:r>
+    </w:p>
+    <w:p>
+      <w:pPr>
+        <w:numPr>
+          <w:ilvl w:val="0"/>
+          <w:numId w:val="6"/>
+        </w:numPr>
+        <w:rPr>
+          <w:rFonts w:ascii="Times New Roman" w:hAnsi="Times New Roman" w:cs="Times New Roman"/>
+        </w:rPr>
+      </w:pPr>
+      <w:r>
+        <w:rPr>
+          <w:rFonts w:ascii="Times New Roman" w:hAnsi="Times New Roman" w:cs="Times New Roman"/>
+          <w:b/>
+          <w:bCs/>
+        </w:rPr>
+        <w:t>Propósito:</w:t>
+      </w:r>
+      <w:r>
+        <w:rPr>
+          <w:rFonts w:ascii="Times New Roman" w:hAnsi="Times New Roman" w:cs="Times New Roman"/>
+        </w:rPr>
+        <w:t xml:space="preserve"> Poblado inicial de registros coherentes para pruebas, cumpliendo con los volúmenes mínimos exigidos (mínimo 40 empresas corporativas con jerarquía matriz-subsidiaria, 300 productos digitales, 250 usuarios, facturas, catálogos comunitarios, reseñas, reembolsos e historial de descuentos).</w:t>
+      </w:r>
+    </w:p>
+    <w:p>
+      <w:pPr>
+        <w:rPr>
+          <w:rFonts w:ascii="Times New Roman" w:hAnsi="Times New Roman" w:cs="Times New Roman"/>
+        </w:rPr>
+      </w:pPr>
+    </w:p>
+    <w:p>
+      <w:pPr>
+        <w:numPr>
+          <w:ilvl w:val="0"/>
+          <w:numId w:val="6"/>
+        </w:numPr>
+        <w:rPr>
+          <w:rFonts w:ascii="Times New Roman" w:hAnsi="Times New Roman" w:cs="Times New Roman"/>
+        </w:rPr>
+      </w:pPr>
+      <w:r>
+        <w:rPr>
+          <w:rFonts w:ascii="Times New Roman" w:hAnsi="Times New Roman" w:cs="Times New Roman"/>
+          <w:b/>
+          <w:bCs/>
+        </w:rPr>
+        <w:t>Orden lógico interno de inserción:</w:t>
+      </w:r>
+    </w:p>
+    <w:p>
+      <w:pPr>
+        <w:rPr>
+          <w:rFonts w:ascii="Times New Roman" w:hAnsi="Times New Roman" w:cs="Times New Roman"/>
+        </w:rPr>
+      </w:pPr>
+      <w:r>
+        <w:rPr>
+          <w:rFonts w:ascii="Times New Roman" w:hAnsi="Times New Roman" w:cs="Times New Roman"/>
+        </w:rPr>
+        <w:br/>
+      </w:r>
+    </w:p>
+    <w:p>
+      <w:pPr>
+        <w:numPr>
+          <w:ilvl w:val="1"/>
+          <w:numId w:val="6"/>
+        </w:numPr>
+        <w:rPr>
+          <w:rFonts w:ascii="Times New Roman" w:hAnsi="Times New Roman" w:cs="Times New Roman"/>
+        </w:rPr>
+      </w:pPr>
+      <w:r>
+        <w:rPr>
+          <w:rFonts w:ascii="Times New Roman" w:hAnsi="Times New Roman" w:cs="Times New Roman"/>
+        </w:rPr>
+        <w:t>Inserción de catálogos base suministrados (</w:t>
+      </w:r>
+      <w:proofErr w:type="spellStart"/>
+      <w:r>
+        <w:rPr>
+          <w:rFonts w:ascii="Times New Roman" w:hAnsi="Times New Roman" w:cs="Times New Roman"/>
+        </w:rPr>
+        <w:t>Lookups.sql</w:t>
+      </w:r>
+      <w:proofErr w:type="spellEnd"/>
+      <w:r>
+        <w:rPr>
+          <w:rFonts w:ascii="Times New Roman" w:hAnsi="Times New Roman" w:cs="Times New Roman"/>
+        </w:rPr>
+        <w:t xml:space="preserve">: </w:t>
+      </w:r>
+      <w:proofErr w:type="spellStart"/>
+      <w:r>
+        <w:rPr>
+          <w:rFonts w:ascii="Times New Roman" w:hAnsi="Times New Roman" w:cs="Times New Roman"/>
+        </w:rPr>
+        <w:t>Categoria_Oficial</w:t>
+      </w:r>
+      <w:proofErr w:type="spellEnd"/>
+      <w:r>
+        <w:rPr>
+          <w:rFonts w:ascii="Times New Roman" w:hAnsi="Times New Roman" w:cs="Times New Roman"/>
+        </w:rPr>
+        <w:t xml:space="preserve">, Idioma, </w:t>
+      </w:r>
+      <w:proofErr w:type="spellStart"/>
+      <w:r>
+        <w:rPr>
+          <w:rFonts w:ascii="Times New Roman" w:hAnsi="Times New Roman" w:cs="Times New Roman"/>
+        </w:rPr>
+        <w:t>Metodo_Pago</w:t>
+      </w:r>
+      <w:proofErr w:type="spellEnd"/>
+      <w:r>
+        <w:rPr>
+          <w:rFonts w:ascii="Times New Roman" w:hAnsi="Times New Roman" w:cs="Times New Roman"/>
+        </w:rPr>
+        <w:t>).</w:t>
+      </w:r>
+    </w:p>
+    <w:p>
+      <w:pPr>
+        <w:rPr>
+          <w:rFonts w:ascii="Times New Roman" w:hAnsi="Times New Roman" w:cs="Times New Roman"/>
+        </w:rPr>
+      </w:pPr>
+    </w:p>
+    <w:p>
+      <w:pPr>
+        <w:numPr>
+          <w:ilvl w:val="1"/>
+          <w:numId w:val="6"/>
+        </w:numPr>
+        <w:rPr>
+          <w:rFonts w:ascii="Times New Roman" w:hAnsi="Times New Roman" w:cs="Times New Roman"/>
+        </w:rPr>
+      </w:pPr>
+      <w:r>
+        <w:rPr>
+          <w:rFonts w:ascii="Times New Roman" w:hAnsi="Times New Roman" w:cs="Times New Roman"/>
+        </w:rPr>
+        <w:t xml:space="preserve">Inserción de registros en </w:t>
+      </w:r>
+      <w:proofErr w:type="spellStart"/>
+      <w:r>
+        <w:rPr>
+          <w:rFonts w:ascii="Times New Roman" w:hAnsi="Times New Roman" w:cs="Times New Roman"/>
+        </w:rPr>
+        <w:t>Empresa_Corporativa</w:t>
+      </w:r>
+      <w:proofErr w:type="spellEnd"/>
+      <w:r>
+        <w:rPr>
+          <w:rFonts w:ascii="Times New Roman" w:hAnsi="Times New Roman" w:cs="Times New Roman"/>
+        </w:rPr>
+        <w:t xml:space="preserve"> (primero empresas matrices con </w:t>
+      </w:r>
+      <w:proofErr w:type="spellStart"/>
+      <w:r>
+        <w:rPr>
+          <w:rFonts w:ascii="Times New Roman" w:hAnsi="Times New Roman" w:cs="Times New Roman"/>
+        </w:rPr>
+        <w:t>ID_Empresa_Matriz</w:t>
+      </w:r>
+      <w:proofErr w:type="spellEnd"/>
+      <w:r>
+        <w:rPr>
+          <w:rFonts w:ascii="Times New Roman" w:hAnsi="Times New Roman" w:cs="Times New Roman"/>
+        </w:rPr>
+        <w:t xml:space="preserve"> IS NULL, seguidas de las subsidiarias).</w:t>
+      </w:r>
+    </w:p>
+    <w:p>
+      <w:pPr>
+        <w:rPr>
+          <w:rFonts w:ascii="Times New Roman" w:hAnsi="Times New Roman" w:cs="Times New Roman"/>
+        </w:rPr>
+      </w:pPr>
+    </w:p>
+    <w:p>
+      <w:pPr>
+        <w:numPr>
+          <w:ilvl w:val="1"/>
+          <w:numId w:val="6"/>
+        </w:numPr>
+        <w:rPr>
+          <w:rFonts w:ascii="Times New Roman" w:hAnsi="Times New Roman" w:cs="Times New Roman"/>
+        </w:rPr>
+      </w:pPr>
+      <w:r>
+        <w:rPr>
+          <w:rFonts w:ascii="Times New Roman" w:hAnsi="Times New Roman" w:cs="Times New Roman"/>
+        </w:rPr>
+        <w:t xml:space="preserve">Inserción de productos en </w:t>
+      </w:r>
+      <w:proofErr w:type="spellStart"/>
+      <w:r>
+        <w:rPr>
+          <w:rFonts w:ascii="Times New Roman" w:hAnsi="Times New Roman" w:cs="Times New Roman"/>
+        </w:rPr>
+        <w:t>Producto_Digital</w:t>
+      </w:r>
+      <w:proofErr w:type="spellEnd"/>
+      <w:r>
+        <w:rPr>
+          <w:rFonts w:ascii="Times New Roman" w:hAnsi="Times New Roman" w:cs="Times New Roman"/>
+        </w:rPr>
+        <w:t xml:space="preserve">, seguida de sus especializaciones en </w:t>
+      </w:r>
+      <w:proofErr w:type="spellStart"/>
+      <w:r>
+        <w:rPr>
+          <w:rFonts w:ascii="Times New Roman" w:hAnsi="Times New Roman" w:cs="Times New Roman"/>
+        </w:rPr>
+        <w:t>Juego_Base</w:t>
+      </w:r>
+      <w:proofErr w:type="spellEnd"/>
+      <w:r>
+        <w:rPr>
+          <w:rFonts w:ascii="Times New Roman" w:hAnsi="Times New Roman" w:cs="Times New Roman"/>
+        </w:rPr>
+        <w:t xml:space="preserve"> y DLC, junto con galerías multimedia, requisitos y logros.</w:t>
+      </w:r>
+    </w:p>
+    <w:p>
+      <w:pPr>
+        <w:rPr>
+          <w:rFonts w:ascii="Times New Roman" w:hAnsi="Times New Roman" w:cs="Times New Roman"/>
+        </w:rPr>
+      </w:pPr>
+    </w:p>
+    <w:p>
+      <w:pPr>
+        <w:numPr>
+          <w:ilvl w:val="1"/>
+          <w:numId w:val="6"/>
+        </w:numPr>
+        <w:rPr>
+          <w:rFonts w:ascii="Times New Roman" w:hAnsi="Times New Roman" w:cs="Times New Roman"/>
+        </w:rPr>
+      </w:pPr>
+      <w:r>
+        <w:rPr>
+          <w:rFonts w:ascii="Times New Roman" w:hAnsi="Times New Roman" w:cs="Times New Roman"/>
+        </w:rPr>
+        <w:t>Inserción de catálogos auxiliares (</w:t>
+      </w:r>
+      <w:proofErr w:type="spellStart"/>
+      <w:r>
+        <w:rPr>
+          <w:rFonts w:ascii="Times New Roman" w:hAnsi="Times New Roman" w:cs="Times New Roman"/>
+        </w:rPr>
+        <w:t>Etiqueta_Comunidad</w:t>
+      </w:r>
+      <w:proofErr w:type="spellEnd"/>
+      <w:r>
+        <w:rPr>
+          <w:rFonts w:ascii="Times New Roman" w:hAnsi="Times New Roman" w:cs="Times New Roman"/>
+        </w:rPr>
+        <w:t xml:space="preserve">, </w:t>
+      </w:r>
+      <w:proofErr w:type="spellStart"/>
+      <w:r>
+        <w:rPr>
+          <w:rFonts w:ascii="Times New Roman" w:hAnsi="Times New Roman" w:cs="Times New Roman"/>
+        </w:rPr>
+        <w:t>Producto_Etiqueta</w:t>
+      </w:r>
+      <w:proofErr w:type="spellEnd"/>
+      <w:r>
+        <w:rPr>
+          <w:rFonts w:ascii="Times New Roman" w:hAnsi="Times New Roman" w:cs="Times New Roman"/>
+        </w:rPr>
+        <w:t>).</w:t>
+      </w:r>
+    </w:p>
+    <w:p>
+      <w:pPr>
+        <w:rPr>
+          <w:rFonts w:ascii="Times New Roman" w:hAnsi="Times New Roman" w:cs="Times New Roman"/>
+        </w:rPr>
+      </w:pPr>
+    </w:p>
+    <w:p>
+      <w:pPr>
+        <w:numPr>
+          <w:ilvl w:val="1"/>
+          <w:numId w:val="6"/>
+        </w:numPr>
+        <w:rPr>
+          <w:rFonts w:ascii="Times New Roman" w:hAnsi="Times New Roman" w:cs="Times New Roman"/>
+        </w:rPr>
+      </w:pPr>
+      <w:r>
+        <w:rPr>
+          <w:rFonts w:ascii="Times New Roman" w:hAnsi="Times New Roman" w:cs="Times New Roman"/>
+        </w:rPr>
+        <w:t>Inserción de Usuario y componentes sociales (</w:t>
+      </w:r>
+      <w:proofErr w:type="spellStart"/>
+      <w:r>
+        <w:rPr>
+          <w:rFonts w:ascii="Times New Roman" w:hAnsi="Times New Roman" w:cs="Times New Roman"/>
+        </w:rPr>
+        <w:t>Amistad_Usuario</w:t>
+      </w:r>
+      <w:proofErr w:type="spellEnd"/>
+      <w:r>
+        <w:rPr>
+          <w:rFonts w:ascii="Times New Roman" w:hAnsi="Times New Roman" w:cs="Times New Roman"/>
+        </w:rPr>
+        <w:t>).</w:t>
+      </w:r>
+    </w:p>
+    <w:p>
+      <w:pPr>
+        <w:rPr>
+          <w:rFonts w:ascii="Times New Roman" w:hAnsi="Times New Roman" w:cs="Times New Roman"/>
+        </w:rPr>
+      </w:pPr>
+    </w:p>
+    <w:p>
+      <w:pPr>
+        <w:numPr>
+          <w:ilvl w:val="1"/>
+          <w:numId w:val="6"/>
+        </w:numPr>
+        <w:rPr>
+          <w:rFonts w:ascii="Times New Roman" w:hAnsi="Times New Roman" w:cs="Times New Roman"/>
+        </w:rPr>
+      </w:pPr>
+      <w:r>
+        <w:rPr>
+          <w:rFonts w:ascii="Times New Roman" w:hAnsi="Times New Roman" w:cs="Times New Roman"/>
+        </w:rPr>
+        <w:t xml:space="preserve">Inserción de registros transaccionales (Biblioteca, </w:t>
+      </w:r>
+      <w:proofErr w:type="spellStart"/>
+      <w:r>
+        <w:rPr>
+          <w:rFonts w:ascii="Times New Roman" w:hAnsi="Times New Roman" w:cs="Times New Roman"/>
+        </w:rPr>
+        <w:t>Lista_Deseos</w:t>
+      </w:r>
+      <w:proofErr w:type="spellEnd"/>
+      <w:r>
+        <w:rPr>
+          <w:rFonts w:ascii="Times New Roman" w:hAnsi="Times New Roman" w:cs="Times New Roman"/>
+        </w:rPr>
+        <w:t xml:space="preserve">, Carrito, </w:t>
+      </w:r>
+      <w:proofErr w:type="spellStart"/>
+      <w:r>
+        <w:rPr>
+          <w:rFonts w:ascii="Times New Roman" w:hAnsi="Times New Roman" w:cs="Times New Roman"/>
+        </w:rPr>
+        <w:t>Resena</w:t>
+      </w:r>
+      <w:proofErr w:type="spellEnd"/>
+      <w:r>
+        <w:rPr>
+          <w:rFonts w:ascii="Times New Roman" w:hAnsi="Times New Roman" w:cs="Times New Roman"/>
+        </w:rPr>
+        <w:t xml:space="preserve">, </w:t>
+      </w:r>
+      <w:proofErr w:type="spellStart"/>
+      <w:r>
+        <w:rPr>
+          <w:rFonts w:ascii="Times New Roman" w:hAnsi="Times New Roman" w:cs="Times New Roman"/>
+        </w:rPr>
+        <w:t>Historial_Descuento</w:t>
+      </w:r>
+      <w:proofErr w:type="spellEnd"/>
+      <w:r>
+        <w:rPr>
+          <w:rFonts w:ascii="Times New Roman" w:hAnsi="Times New Roman" w:cs="Times New Roman"/>
+        </w:rPr>
+        <w:t xml:space="preserve">, </w:t>
+      </w:r>
+      <w:proofErr w:type="spellStart"/>
+      <w:r>
+        <w:rPr>
+          <w:rFonts w:ascii="Times New Roman" w:hAnsi="Times New Roman" w:cs="Times New Roman"/>
+        </w:rPr>
+        <w:t>Registro_Concurrencia</w:t>
+      </w:r>
+      <w:proofErr w:type="spellEnd"/>
+      <w:r>
+        <w:rPr>
+          <w:rFonts w:ascii="Times New Roman" w:hAnsi="Times New Roman" w:cs="Times New Roman"/>
+        </w:rPr>
+        <w:t xml:space="preserve">, Factura, </w:t>
+      </w:r>
+      <w:proofErr w:type="spellStart"/>
+      <w:r>
+        <w:rPr>
+          <w:rFonts w:ascii="Times New Roman" w:hAnsi="Times New Roman" w:cs="Times New Roman"/>
+        </w:rPr>
+        <w:t>Detalle_Factura</w:t>
+      </w:r>
+      <w:proofErr w:type="spellEnd"/>
+      <w:r>
+        <w:rPr>
+          <w:rFonts w:ascii="Times New Roman" w:hAnsi="Times New Roman" w:cs="Times New Roman"/>
+        </w:rPr>
+        <w:t xml:space="preserve">, Reembolso, </w:t>
+      </w:r>
+      <w:proofErr w:type="spellStart"/>
+      <w:r>
+        <w:rPr>
+          <w:rFonts w:ascii="Times New Roman" w:hAnsi="Times New Roman" w:cs="Times New Roman"/>
+        </w:rPr>
+        <w:t>Suscripcion_Mod</w:t>
+      </w:r>
+      <w:proofErr w:type="spellEnd"/>
+      <w:r>
+        <w:rPr>
+          <w:rFonts w:ascii="Times New Roman" w:hAnsi="Times New Roman" w:cs="Times New Roman"/>
+        </w:rPr>
+        <w:t>).</w:t>
+      </w:r>
+    </w:p>
+    <w:p>
+      <w:pPr>
+        <w:rPr>
+          <w:rFonts w:ascii="Times New Roman" w:hAnsi="Times New Roman" w:cs="Times New Roman"/>
+        </w:rPr>
+      </w:pPr>
+    </w:p>
+    <w:p>
+      <w:pPr>
+        <w:rPr>
+          <w:rFonts w:ascii="Times New Roman" w:hAnsi="Times New Roman" w:cs="Times New Roman"/>
+          <w:b/>
+          <w:bCs/>
+        </w:rPr>
+      </w:pPr>
+      <w:r>
+        <w:rPr>
+          <w:rFonts w:ascii="Times New Roman" w:hAnsi="Times New Roman" w:cs="Times New Roman"/>
+          <w:b/>
+          <w:bCs/>
+        </w:rPr>
+        <w:t xml:space="preserve">3. </w:t>
+      </w:r>
+      <w:proofErr w:type="spellStart"/>
+      <w:r>
+        <w:rPr>
+          <w:rFonts w:ascii="Times New Roman" w:hAnsi="Times New Roman" w:cs="Times New Roman"/>
+        </w:rPr>
+        <w:t>Programmability.sql</w:t>
+      </w:r>
+      <w:proofErr w:type="spellEnd"/>
+      <w:r>
+        <w:rPr>
+          <w:rFonts w:ascii="Times New Roman" w:hAnsi="Times New Roman" w:cs="Times New Roman"/>
+          <w:b/>
+          <w:bCs/>
+        </w:rPr>
+        <w:t xml:space="preserve"> (Lógica de Negocio: </w:t>
+      </w:r>
+      <w:proofErr w:type="spellStart"/>
+      <w:r>
+        <w:rPr>
+          <w:rFonts w:ascii="Times New Roman" w:hAnsi="Times New Roman" w:cs="Times New Roman"/>
+          <w:b/>
+          <w:bCs/>
+        </w:rPr>
+        <w:t>SPs</w:t>
+      </w:r>
+      <w:proofErr w:type="spellEnd"/>
+      <w:r>
+        <w:rPr>
+          <w:rFonts w:ascii="Times New Roman" w:hAnsi="Times New Roman" w:cs="Times New Roman"/>
+          <w:b/>
+          <w:bCs/>
+        </w:rPr>
+        <w:t xml:space="preserve">, Funciones y </w:t>
+      </w:r>
+      <w:proofErr w:type="spellStart"/>
+      <w:r>
+        <w:rPr>
+          <w:rFonts w:ascii="Times New Roman" w:hAnsi="Times New Roman" w:cs="Times New Roman"/>
+          <w:b/>
+          <w:bCs/>
+        </w:rPr>
+        <w:t>Triggers</w:t>
+      </w:r>
+      <w:proofErr w:type="spellEnd"/>
+      <w:r>
+        <w:rPr>
+          <w:rFonts w:ascii="Times New Roman" w:hAnsi="Times New Roman" w:cs="Times New Roman"/>
+          <w:b/>
+          <w:bCs/>
+        </w:rPr>
+        <w:t>)</w:t>
+      </w:r>
+    </w:p>
+    <w:p>
+      <w:pPr>
+        <w:numPr>
+          <w:ilvl w:val="0"/>
+          <w:numId w:val="7"/>
+        </w:numPr>
+        <w:rPr>
+          <w:rFonts w:ascii="Times New Roman" w:hAnsi="Times New Roman" w:cs="Times New Roman"/>
+        </w:rPr>
+      </w:pPr>
+      <w:r>
+        <w:rPr>
+          <w:rFonts w:ascii="Times New Roman" w:hAnsi="Times New Roman" w:cs="Times New Roman"/>
+          <w:b/>
+          <w:bCs/>
+        </w:rPr>
+        <w:t>Propósito:</w:t>
+      </w:r>
+      <w:r>
+        <w:rPr>
+          <w:rFonts w:ascii="Times New Roman" w:hAnsi="Times New Roman" w:cs="Times New Roman"/>
+        </w:rPr>
+        <w:t xml:space="preserve"> Creación de procedimientos almacenados de gestión operativa (</w:t>
+      </w:r>
+      <w:proofErr w:type="spellStart"/>
+      <w:r>
+        <w:rPr>
+          <w:rFonts w:ascii="Times New Roman" w:hAnsi="Times New Roman" w:cs="Times New Roman"/>
+        </w:rPr>
+        <w:t>sp_realizar_compra</w:t>
+      </w:r>
+      <w:proofErr w:type="spellEnd"/>
+      <w:r>
+        <w:rPr>
+          <w:rFonts w:ascii="Times New Roman" w:hAnsi="Times New Roman" w:cs="Times New Roman"/>
+        </w:rPr>
+        <w:t xml:space="preserve">, </w:t>
+      </w:r>
+      <w:proofErr w:type="spellStart"/>
+      <w:r>
+        <w:rPr>
+          <w:rFonts w:ascii="Times New Roman" w:hAnsi="Times New Roman" w:cs="Times New Roman"/>
+        </w:rPr>
+        <w:t>sp_dashboard_estudio</w:t>
+      </w:r>
+      <w:proofErr w:type="spellEnd"/>
+      <w:r>
+        <w:rPr>
+          <w:rFonts w:ascii="Times New Roman" w:hAnsi="Times New Roman" w:cs="Times New Roman"/>
+        </w:rPr>
+        <w:t xml:space="preserve">, </w:t>
+      </w:r>
+      <w:proofErr w:type="spellStart"/>
+      <w:r>
+        <w:rPr>
+          <w:rFonts w:ascii="Times New Roman" w:hAnsi="Times New Roman" w:cs="Times New Roman"/>
+        </w:rPr>
+        <w:t>sp_publicar_producto_con_etiquetas</w:t>
+      </w:r>
+      <w:proofErr w:type="spellEnd"/>
+      <w:r>
+        <w:rPr>
+          <w:rFonts w:ascii="Times New Roman" w:hAnsi="Times New Roman" w:cs="Times New Roman"/>
+        </w:rPr>
+        <w:t xml:space="preserve">, </w:t>
+      </w:r>
+      <w:proofErr w:type="spellStart"/>
+      <w:r>
+        <w:rPr>
+          <w:rFonts w:ascii="Times New Roman" w:hAnsi="Times New Roman" w:cs="Times New Roman"/>
+        </w:rPr>
+        <w:t>sp_procesar_reembolso</w:t>
+      </w:r>
+      <w:proofErr w:type="spellEnd"/>
+      <w:r>
+        <w:rPr>
+          <w:rFonts w:ascii="Times New Roman" w:hAnsi="Times New Roman" w:cs="Times New Roman"/>
+        </w:rPr>
+        <w:t xml:space="preserve">, </w:t>
+      </w:r>
+      <w:proofErr w:type="spellStart"/>
+      <w:r>
+        <w:rPr>
+          <w:rFonts w:ascii="Times New Roman" w:hAnsi="Times New Roman" w:cs="Times New Roman"/>
+        </w:rPr>
+        <w:t>sp_desbloquear_logro</w:t>
+      </w:r>
+      <w:proofErr w:type="spellEnd"/>
+      <w:r>
+        <w:rPr>
+          <w:rFonts w:ascii="Times New Roman" w:hAnsi="Times New Roman" w:cs="Times New Roman"/>
+        </w:rPr>
+        <w:t>), funciones escalares y de tabla (</w:t>
+      </w:r>
+      <w:proofErr w:type="spellStart"/>
+      <w:r>
+        <w:rPr>
+          <w:rFonts w:ascii="Times New Roman" w:hAnsi="Times New Roman" w:cs="Times New Roman"/>
+        </w:rPr>
+        <w:t>fn_calcular_impuesto</w:t>
+      </w:r>
+      <w:proofErr w:type="spellEnd"/>
+      <w:r>
+        <w:rPr>
+          <w:rFonts w:ascii="Times New Roman" w:hAnsi="Times New Roman" w:cs="Times New Roman"/>
+        </w:rPr>
+        <w:t xml:space="preserve">, </w:t>
+      </w:r>
+      <w:proofErr w:type="spellStart"/>
+      <w:r>
+        <w:rPr>
+          <w:rFonts w:ascii="Times New Roman" w:hAnsi="Times New Roman" w:cs="Times New Roman"/>
+        </w:rPr>
+        <w:t>fn_precio_con_descuento</w:t>
+      </w:r>
+      <w:proofErr w:type="spellEnd"/>
+      <w:r>
+        <w:rPr>
+          <w:rFonts w:ascii="Times New Roman" w:hAnsi="Times New Roman" w:cs="Times New Roman"/>
+        </w:rPr>
+        <w:t xml:space="preserve">, </w:t>
+      </w:r>
+      <w:proofErr w:type="spellStart"/>
+      <w:r>
+        <w:rPr>
+          <w:rFonts w:ascii="Times New Roman" w:hAnsi="Times New Roman" w:cs="Times New Roman"/>
+        </w:rPr>
+        <w:t>fn_clasificar_ingreso</w:t>
+      </w:r>
+      <w:proofErr w:type="spellEnd"/>
+      <w:r>
+        <w:rPr>
+          <w:rFonts w:ascii="Times New Roman" w:hAnsi="Times New Roman" w:cs="Times New Roman"/>
+        </w:rPr>
+        <w:t xml:space="preserve">, </w:t>
+      </w:r>
+      <w:proofErr w:type="spellStart"/>
+      <w:r>
+        <w:rPr>
+          <w:rFonts w:ascii="Times New Roman" w:hAnsi="Times New Roman" w:cs="Times New Roman"/>
+        </w:rPr>
+        <w:t>fn_calcular_reputacion</w:t>
+      </w:r>
+      <w:proofErr w:type="spellEnd"/>
+      <w:r>
+        <w:rPr>
+          <w:rFonts w:ascii="Times New Roman" w:hAnsi="Times New Roman" w:cs="Times New Roman"/>
+        </w:rPr>
+        <w:t xml:space="preserve">, </w:t>
+      </w:r>
+      <w:proofErr w:type="spellStart"/>
+      <w:r>
+        <w:rPr>
+          <w:rFonts w:ascii="Times New Roman" w:hAnsi="Times New Roman" w:cs="Times New Roman"/>
+        </w:rPr>
+        <w:t>fn_calcular_horas_totales_usuario</w:t>
+      </w:r>
+      <w:proofErr w:type="spellEnd"/>
+      <w:r>
+        <w:rPr>
+          <w:rFonts w:ascii="Times New Roman" w:hAnsi="Times New Roman" w:cs="Times New Roman"/>
+        </w:rPr>
+        <w:t>) y disparadores de control y automatización (</w:t>
+      </w:r>
+      <w:proofErr w:type="spellStart"/>
+      <w:r>
+        <w:rPr>
+          <w:rFonts w:ascii="Times New Roman" w:hAnsi="Times New Roman" w:cs="Times New Roman"/>
+        </w:rPr>
+        <w:t>Triggers</w:t>
+      </w:r>
+      <w:proofErr w:type="spellEnd"/>
+      <w:r>
+        <w:rPr>
+          <w:rFonts w:ascii="Times New Roman" w:hAnsi="Times New Roman" w:cs="Times New Roman"/>
+        </w:rPr>
+        <w:t xml:space="preserve"> 1 al 5).</w:t>
+      </w:r>
+    </w:p>
+    <w:p>
+      <w:pPr>
+        <w:rPr>
+          <w:rFonts w:ascii="Times New Roman" w:hAnsi="Times New Roman" w:cs="Times New Roman"/>
+        </w:rPr>
+      </w:pPr>
+    </w:p>
+    <w:p>
+      <w:pPr>
+        <w:numPr>
+          <w:ilvl w:val="0"/>
+          <w:numId w:val="7"/>
+        </w:numPr>
+        <w:rPr>
+          <w:rFonts w:ascii="Times New Roman" w:hAnsi="Times New Roman" w:cs="Times New Roman"/>
+        </w:rPr>
+      </w:pPr>
+      <w:r>
+        <w:rPr>
+          <w:rFonts w:ascii="Times New Roman" w:hAnsi="Times New Roman" w:cs="Times New Roman"/>
+          <w:b/>
+          <w:bCs/>
+        </w:rPr>
+        <w:lastRenderedPageBreak/>
+        <w:t>Nota de ejecución:</w:t>
+      </w:r>
+      <w:r>
+        <w:rPr>
+          <w:rFonts w:ascii="Times New Roman" w:hAnsi="Times New Roman" w:cs="Times New Roman"/>
+        </w:rPr>
+        <w:t xml:space="preserve"> Se recomienda compilar las funciones primero, ya que los procedimientos almacenados y </w:t>
+      </w:r>
+      <w:proofErr w:type="spellStart"/>
+      <w:r>
+        <w:rPr>
+          <w:rFonts w:ascii="Times New Roman" w:hAnsi="Times New Roman" w:cs="Times New Roman"/>
+        </w:rPr>
+        <w:t>triggers</w:t>
+      </w:r>
+      <w:proofErr w:type="spellEnd"/>
+      <w:r>
+        <w:rPr>
+          <w:rFonts w:ascii="Times New Roman" w:hAnsi="Times New Roman" w:cs="Times New Roman"/>
+        </w:rPr>
+        <w:t xml:space="preserve"> pueden depender de ellas para su correcta resolución de dependencias en SQL Server.</w:t>
+      </w:r>
+    </w:p>
+    <w:p>
+      <w:pPr>
+        <w:rPr>
+          <w:rFonts w:ascii="Times New Roman" w:hAnsi="Times New Roman" w:cs="Times New Roman"/>
+        </w:rPr>
+      </w:pPr>
+    </w:p>
+    <w:p>
+      <w:pPr>
+        <w:rPr>
+          <w:rFonts w:ascii="Times New Roman" w:hAnsi="Times New Roman" w:cs="Times New Roman"/>
+          <w:b/>
+          <w:bCs/>
+        </w:rPr>
+      </w:pPr>
+      <w:r>
+        <w:rPr>
+          <w:rFonts w:ascii="Times New Roman" w:hAnsi="Times New Roman" w:cs="Times New Roman"/>
+          <w:b/>
+          <w:bCs/>
+        </w:rPr>
+        <w:t xml:space="preserve">4. </w:t>
+      </w:r>
+      <w:proofErr w:type="spellStart"/>
+      <w:r>
+        <w:rPr>
+          <w:rFonts w:ascii="Times New Roman" w:hAnsi="Times New Roman" w:cs="Times New Roman"/>
+        </w:rPr>
+        <w:t>Queries.sql</w:t>
+      </w:r>
+      <w:proofErr w:type="spellEnd"/>
+      <w:r>
+        <w:rPr>
+          <w:rFonts w:ascii="Times New Roman" w:hAnsi="Times New Roman" w:cs="Times New Roman"/>
+          <w:b/>
+          <w:bCs/>
+        </w:rPr>
+        <w:t xml:space="preserve"> (Consultas de Reporte Analítico)</w:t>
+      </w:r>
+    </w:p>
+    <w:p>
+      <w:pPr>
+        <w:numPr>
+          <w:ilvl w:val="0"/>
+          <w:numId w:val="8"/>
+        </w:numPr>
+        <w:rPr>
+          <w:rFonts w:ascii="Times New Roman" w:hAnsi="Times New Roman" w:cs="Times New Roman"/>
+        </w:rPr>
+      </w:pPr>
+      <w:r>
+        <w:rPr>
+          <w:rFonts w:ascii="Times New Roman" w:hAnsi="Times New Roman" w:cs="Times New Roman"/>
+          <w:b/>
+          <w:bCs/>
+        </w:rPr>
+        <w:t>Propósito:</w:t>
+      </w:r>
+      <w:r>
+        <w:rPr>
+          <w:rFonts w:ascii="Times New Roman" w:hAnsi="Times New Roman" w:cs="Times New Roman"/>
+        </w:rPr>
+        <w:t xml:space="preserve"> Ejecución de los 20 reportes analíticos y de negocio requeridos (clasificación de estudios, éxito por categoría, análisis de correos, retención, peso del catálogo, mapas de calor financiero, bibliotecas cruzadas, segmentación generacional, juegos polémicos, ranking de élite, usuarios </w:t>
+      </w:r>
+      <w:proofErr w:type="spellStart"/>
+      <w:r>
+        <w:rPr>
+          <w:rFonts w:ascii="Times New Roman" w:hAnsi="Times New Roman" w:cs="Times New Roman"/>
+        </w:rPr>
+        <w:t>lurkers</w:t>
+      </w:r>
+      <w:proofErr w:type="spellEnd"/>
+      <w:r>
+        <w:rPr>
+          <w:rFonts w:ascii="Times New Roman" w:hAnsi="Times New Roman" w:cs="Times New Roman"/>
+        </w:rPr>
+        <w:t xml:space="preserve">, tendencias de etiquetas, cobertura total de coleccionistas, liquidación de regalías, ecosistema Sims 4, red cooperativa </w:t>
+      </w:r>
+      <w:proofErr w:type="spellStart"/>
+      <w:r>
+        <w:rPr>
+          <w:rFonts w:ascii="Times New Roman" w:hAnsi="Times New Roman" w:cs="Times New Roman"/>
+        </w:rPr>
+        <w:t>Overcooked</w:t>
+      </w:r>
+      <w:proofErr w:type="spellEnd"/>
+      <w:r>
+        <w:rPr>
+          <w:rFonts w:ascii="Times New Roman" w:hAnsi="Times New Roman" w:cs="Times New Roman"/>
+        </w:rPr>
+        <w:t>, éxito a precio completo, imperios corporativos, críticos inexpertos y círculos de confianza).</w:t>
+      </w:r>
+    </w:p>
+    <w:p>
+      <w:pPr>
+        <w:jc w:val="center"/>
+        <w:rPr>
+          <w:rFonts w:ascii="Times New Roman" w:hAnsi="Times New Roman" w:cs="Times New Roman"/>
+        </w:rPr>
+      </w:pPr>
     </w:p>
     <w:sectPr>
       <w:pgSz w:w="12240" w:h="15840"/>
@@ -794,6 +3452,1219 @@
     </w:sectPr>
   </w:body>
 </w:document>
+</file>
+
+<file path=word/numbering.xml><?xml version="1.0" encoding="utf-8"?>
+<w:numbering xmlns:wpc="http://schemas.microsoft.com/office/word/2010/wordprocessingCanvas" xmlns:cx="http://schemas.microsoft.com/office/drawing/2014/chartex" xmlns:cx1="http://schemas.microsoft.com/office/drawing/2015/9/8/chartex" xmlns:cx2="http://schemas.microsoft.com/office/drawing/2015/10/21/chartex" xmlns:cx3="http://schemas.microsoft.com/office/drawing/2016/5/9/chartex" xmlns:cx4="http://schemas.microsoft.com/office/drawing/2016/5/10/chartex" xmlns:cx5="http://schemas.microsoft.com/office/drawing/2016/5/11/chartex" xmlns:cx6="http://schemas.microsoft.com/office/drawing/2016/5/12/chartex" xmlns:cx7="http://schemas.microsoft.com/office/drawing/2016/5/13/chartex" xmlns:cx8="http://schemas.microsoft.com/office/drawing/2016/5/14/chartex" xmlns:mc="http://schemas.openxmlformats.org/markup-compatibility/2006" xmlns:aink="http://schemas.microsoft.com/office/drawing/2016/ink" xmlns:am3d="http://schemas.microsoft.com/office/drawing/2017/model3d" xmlns:o="urn:schemas-microsoft-com:office:office" xmlns:oel="http://schemas.microsoft.com/office/2019/extlst" xmlns:r="http://schemas.openxmlformats.org/officeDocument/2006/relationships" xmlns:m="http://schemas.openxmlformats.org/officeDocument/2006/math" xmlns:v="urn:schemas-microsoft-com:vml" xmlns:wp14="http://schemas.microsoft.com/office/word/2010/wordprocessingDrawing" xmlns:wp="http://schemas.openxmlformats.org/drawingml/2006/wordprocessingDrawing" xmlns:w10="urn:schemas-microsoft-com:office:word" xmlns:w="http://schemas.openxmlformats.org/wordprocessingml/2006/main" xmlns:w14="http://schemas.microsoft.com/office/word/2010/wordml" xmlns:w15="http://schemas.microsoft.com/office/word/2012/wordml" xmlns:w16cex="http://schemas.microsoft.com/office/word/2018/wordml/cex" xmlns:w16cid="http://schemas.microsoft.com/office/word/2016/wordml/cid" xmlns:w16="http://schemas.microsoft.com/office/word/2018/wordml" xmlns:w16du="http://schemas.microsoft.com/office/word/2023/wordml/word16du" xmlns:w16sdtdh="http://schemas.microsoft.com/office/word/2020/wordml/sdtdatahash" xmlns:w16sdtfl="http://schemas.microsoft.com/office/word/2024/wordml/sdtformatlock" xmlns:w16se="http://schemas.microsoft.com/office/word/2015/wordml/symex" xmlns:wpg="http://schemas.microsoft.com/office/word/2010/wordprocessingGroup" xmlns:wpi="http://schemas.microsoft.com/office/word/2010/wordprocessingInk" xmlns:wne="http://schemas.microsoft.com/office/word/2006/wordml" xmlns:wps="http://schemas.microsoft.com/office/word/2010/wordprocessingShape" mc:Ignorable="w14 w15 w16se w16cid w16 w16cex w16sdtdh w16sdtfl w16du wp14">
+  <w:abstractNum w:abstractNumId="0" w15:restartNumberingAfterBreak="0">
+    <w:nsid w:val="0C4C6DD1"/>
+    <w:multiLevelType w:val="multilevel"/>
+    <w:tmpl w:val="79A4EDCE"/>
+    <w:lvl w:ilvl="0">
+      <w:start w:val="1"/>
+      <w:numFmt w:val="bullet"/>
+      <w:lvlText w:val=""/>
+      <w:lvlJc w:val="left"/>
+      <w:pPr>
+        <w:tabs>
+          <w:tab w:val="num" w:pos="720"/>
+        </w:tabs>
+        <w:ind w:left="720" w:hanging="360"/>
+      </w:pPr>
+      <w:rPr>
+        <w:rFonts w:ascii="Symbol" w:hAnsi="Symbol" w:hint="default"/>
+        <w:sz w:val="20"/>
+      </w:rPr>
+    </w:lvl>
+    <w:lvl w:ilvl="1" w:tentative="1">
+      <w:start w:val="1"/>
+      <w:numFmt w:val="bullet"/>
+      <w:lvlText w:val="o"/>
+      <w:lvlJc w:val="left"/>
+      <w:pPr>
+        <w:tabs>
+          <w:tab w:val="num" w:pos="1440"/>
+        </w:tabs>
+        <w:ind w:left="1440" w:hanging="360"/>
+      </w:pPr>
+      <w:rPr>
+        <w:rFonts w:ascii="Courier New" w:hAnsi="Courier New" w:hint="default"/>
+        <w:sz w:val="20"/>
+      </w:rPr>
+    </w:lvl>
+    <w:lvl w:ilvl="2" w:tentative="1">
+      <w:start w:val="1"/>
+      <w:numFmt w:val="bullet"/>
+      <w:lvlText w:val=""/>
+      <w:lvlJc w:val="left"/>
+      <w:pPr>
+        <w:tabs>
+          <w:tab w:val="num" w:pos="2160"/>
+        </w:tabs>
+        <w:ind w:left="2160" w:hanging="360"/>
+      </w:pPr>
+      <w:rPr>
+        <w:rFonts w:ascii="Wingdings" w:hAnsi="Wingdings" w:hint="default"/>
+        <w:sz w:val="20"/>
+      </w:rPr>
+    </w:lvl>
+    <w:lvl w:ilvl="3" w:tentative="1">
+      <w:start w:val="1"/>
+      <w:numFmt w:val="bullet"/>
+      <w:lvlText w:val=""/>
+      <w:lvlJc w:val="left"/>
+      <w:pPr>
+        <w:tabs>
+          <w:tab w:val="num" w:pos="2880"/>
+        </w:tabs>
+        <w:ind w:left="2880" w:hanging="360"/>
+      </w:pPr>
+      <w:rPr>
+        <w:rFonts w:ascii="Wingdings" w:hAnsi="Wingdings" w:hint="default"/>
+        <w:sz w:val="20"/>
+      </w:rPr>
+    </w:lvl>
+    <w:lvl w:ilvl="4" w:tentative="1">
+      <w:start w:val="1"/>
+      <w:numFmt w:val="bullet"/>
+      <w:lvlText w:val=""/>
+      <w:lvlJc w:val="left"/>
+      <w:pPr>
+        <w:tabs>
+          <w:tab w:val="num" w:pos="3600"/>
+        </w:tabs>
+        <w:ind w:left="3600" w:hanging="360"/>
+      </w:pPr>
+      <w:rPr>
+        <w:rFonts w:ascii="Wingdings" w:hAnsi="Wingdings" w:hint="default"/>
+        <w:sz w:val="20"/>
+      </w:rPr>
+    </w:lvl>
+    <w:lvl w:ilvl="5" w:tentative="1">
+      <w:start w:val="1"/>
+      <w:numFmt w:val="bullet"/>
+      <w:lvlText w:val=""/>
+      <w:lvlJc w:val="left"/>
+      <w:pPr>
+        <w:tabs>
+          <w:tab w:val="num" w:pos="4320"/>
+        </w:tabs>
+        <w:ind w:left="4320" w:hanging="360"/>
+      </w:pPr>
+      <w:rPr>
+        <w:rFonts w:ascii="Wingdings" w:hAnsi="Wingdings" w:hint="default"/>
+        <w:sz w:val="20"/>
+      </w:rPr>
+    </w:lvl>
+    <w:lvl w:ilvl="6" w:tentative="1">
+      <w:start w:val="1"/>
+      <w:numFmt w:val="bullet"/>
+      <w:lvlText w:val=""/>
+      <w:lvlJc w:val="left"/>
+      <w:pPr>
+        <w:tabs>
+          <w:tab w:val="num" w:pos="5040"/>
+        </w:tabs>
+        <w:ind w:left="5040" w:hanging="360"/>
+      </w:pPr>
+      <w:rPr>
+        <w:rFonts w:ascii="Wingdings" w:hAnsi="Wingdings" w:hint="default"/>
+        <w:sz w:val="20"/>
+      </w:rPr>
+    </w:lvl>
+    <w:lvl w:ilvl="7" w:tentative="1">
+      <w:start w:val="1"/>
+      <w:numFmt w:val="bullet"/>
+      <w:lvlText w:val=""/>
+      <w:lvlJc w:val="left"/>
+      <w:pPr>
+        <w:tabs>
+          <w:tab w:val="num" w:pos="5760"/>
+        </w:tabs>
+        <w:ind w:left="5760" w:hanging="360"/>
+      </w:pPr>
+      <w:rPr>
+        <w:rFonts w:ascii="Wingdings" w:hAnsi="Wingdings" w:hint="default"/>
+        <w:sz w:val="20"/>
+      </w:rPr>
+    </w:lvl>
+    <w:lvl w:ilvl="8" w:tentative="1">
+      <w:start w:val="1"/>
+      <w:numFmt w:val="bullet"/>
+      <w:lvlText w:val=""/>
+      <w:lvlJc w:val="left"/>
+      <w:pPr>
+        <w:tabs>
+          <w:tab w:val="num" w:pos="6480"/>
+        </w:tabs>
+        <w:ind w:left="6480" w:hanging="360"/>
+      </w:pPr>
+      <w:rPr>
+        <w:rFonts w:ascii="Wingdings" w:hAnsi="Wingdings" w:hint="default"/>
+        <w:sz w:val="20"/>
+      </w:rPr>
+    </w:lvl>
+  </w:abstractNum>
+  <w:abstractNum w:abstractNumId="1" w15:restartNumberingAfterBreak="0">
+    <w:nsid w:val="142A427F"/>
+    <w:multiLevelType w:val="multilevel"/>
+    <w:tmpl w:val="68D08FB4"/>
+    <w:lvl w:ilvl="0">
+      <w:start w:val="1"/>
+      <w:numFmt w:val="bullet"/>
+      <w:lvlText w:val=""/>
+      <w:lvlJc w:val="left"/>
+      <w:pPr>
+        <w:tabs>
+          <w:tab w:val="num" w:pos="720"/>
+        </w:tabs>
+        <w:ind w:left="720" w:hanging="360"/>
+      </w:pPr>
+      <w:rPr>
+        <w:rFonts w:ascii="Symbol" w:hAnsi="Symbol" w:hint="default"/>
+        <w:sz w:val="20"/>
+      </w:rPr>
+    </w:lvl>
+    <w:lvl w:ilvl="1" w:tentative="1">
+      <w:start w:val="1"/>
+      <w:numFmt w:val="bullet"/>
+      <w:lvlText w:val="o"/>
+      <w:lvlJc w:val="left"/>
+      <w:pPr>
+        <w:tabs>
+          <w:tab w:val="num" w:pos="1440"/>
+        </w:tabs>
+        <w:ind w:left="1440" w:hanging="360"/>
+      </w:pPr>
+      <w:rPr>
+        <w:rFonts w:ascii="Courier New" w:hAnsi="Courier New" w:hint="default"/>
+        <w:sz w:val="20"/>
+      </w:rPr>
+    </w:lvl>
+    <w:lvl w:ilvl="2" w:tentative="1">
+      <w:start w:val="1"/>
+      <w:numFmt w:val="bullet"/>
+      <w:lvlText w:val=""/>
+      <w:lvlJc w:val="left"/>
+      <w:pPr>
+        <w:tabs>
+          <w:tab w:val="num" w:pos="2160"/>
+        </w:tabs>
+        <w:ind w:left="2160" w:hanging="360"/>
+      </w:pPr>
+      <w:rPr>
+        <w:rFonts w:ascii="Wingdings" w:hAnsi="Wingdings" w:hint="default"/>
+        <w:sz w:val="20"/>
+      </w:rPr>
+    </w:lvl>
+    <w:lvl w:ilvl="3" w:tentative="1">
+      <w:start w:val="1"/>
+      <w:numFmt w:val="bullet"/>
+      <w:lvlText w:val=""/>
+      <w:lvlJc w:val="left"/>
+      <w:pPr>
+        <w:tabs>
+          <w:tab w:val="num" w:pos="2880"/>
+        </w:tabs>
+        <w:ind w:left="2880" w:hanging="360"/>
+      </w:pPr>
+      <w:rPr>
+        <w:rFonts w:ascii="Wingdings" w:hAnsi="Wingdings" w:hint="default"/>
+        <w:sz w:val="20"/>
+      </w:rPr>
+    </w:lvl>
+    <w:lvl w:ilvl="4" w:tentative="1">
+      <w:start w:val="1"/>
+      <w:numFmt w:val="bullet"/>
+      <w:lvlText w:val=""/>
+      <w:lvlJc w:val="left"/>
+      <w:pPr>
+        <w:tabs>
+          <w:tab w:val="num" w:pos="3600"/>
+        </w:tabs>
+        <w:ind w:left="3600" w:hanging="360"/>
+      </w:pPr>
+      <w:rPr>
+        <w:rFonts w:ascii="Wingdings" w:hAnsi="Wingdings" w:hint="default"/>
+        <w:sz w:val="20"/>
+      </w:rPr>
+    </w:lvl>
+    <w:lvl w:ilvl="5" w:tentative="1">
+      <w:start w:val="1"/>
+      <w:numFmt w:val="bullet"/>
+      <w:lvlText w:val=""/>
+      <w:lvlJc w:val="left"/>
+      <w:pPr>
+        <w:tabs>
+          <w:tab w:val="num" w:pos="4320"/>
+        </w:tabs>
+        <w:ind w:left="4320" w:hanging="360"/>
+      </w:pPr>
+      <w:rPr>
+        <w:rFonts w:ascii="Wingdings" w:hAnsi="Wingdings" w:hint="default"/>
+        <w:sz w:val="20"/>
+      </w:rPr>
+    </w:lvl>
+    <w:lvl w:ilvl="6" w:tentative="1">
+      <w:start w:val="1"/>
+      <w:numFmt w:val="bullet"/>
+      <w:lvlText w:val=""/>
+      <w:lvlJc w:val="left"/>
+      <w:pPr>
+        <w:tabs>
+          <w:tab w:val="num" w:pos="5040"/>
+        </w:tabs>
+        <w:ind w:left="5040" w:hanging="360"/>
+      </w:pPr>
+      <w:rPr>
+        <w:rFonts w:ascii="Wingdings" w:hAnsi="Wingdings" w:hint="default"/>
+        <w:sz w:val="20"/>
+      </w:rPr>
+    </w:lvl>
+    <w:lvl w:ilvl="7" w:tentative="1">
+      <w:start w:val="1"/>
+      <w:numFmt w:val="bullet"/>
+      <w:lvlText w:val=""/>
+      <w:lvlJc w:val="left"/>
+      <w:pPr>
+        <w:tabs>
+          <w:tab w:val="num" w:pos="5760"/>
+        </w:tabs>
+        <w:ind w:left="5760" w:hanging="360"/>
+      </w:pPr>
+      <w:rPr>
+        <w:rFonts w:ascii="Wingdings" w:hAnsi="Wingdings" w:hint="default"/>
+        <w:sz w:val="20"/>
+      </w:rPr>
+    </w:lvl>
+    <w:lvl w:ilvl="8" w:tentative="1">
+      <w:start w:val="1"/>
+      <w:numFmt w:val="bullet"/>
+      <w:lvlText w:val=""/>
+      <w:lvlJc w:val="left"/>
+      <w:pPr>
+        <w:tabs>
+          <w:tab w:val="num" w:pos="6480"/>
+        </w:tabs>
+        <w:ind w:left="6480" w:hanging="360"/>
+      </w:pPr>
+      <w:rPr>
+        <w:rFonts w:ascii="Wingdings" w:hAnsi="Wingdings" w:hint="default"/>
+        <w:sz w:val="20"/>
+      </w:rPr>
+    </w:lvl>
+  </w:abstractNum>
+  <w:abstractNum w:abstractNumId="2" w15:restartNumberingAfterBreak="0">
+    <w:nsid w:val="2C155E3F"/>
+    <w:multiLevelType w:val="multilevel"/>
+    <w:tmpl w:val="AC8E632C"/>
+    <w:lvl w:ilvl="0">
+      <w:start w:val="1"/>
+      <w:numFmt w:val="bullet"/>
+      <w:lvlText w:val=""/>
+      <w:lvlJc w:val="left"/>
+      <w:pPr>
+        <w:tabs>
+          <w:tab w:val="num" w:pos="720"/>
+        </w:tabs>
+        <w:ind w:left="720" w:hanging="360"/>
+      </w:pPr>
+      <w:rPr>
+        <w:rFonts w:ascii="Symbol" w:hAnsi="Symbol" w:hint="default"/>
+        <w:sz w:val="20"/>
+      </w:rPr>
+    </w:lvl>
+    <w:lvl w:ilvl="1">
+      <w:start w:val="1"/>
+      <w:numFmt w:val="decimal"/>
+      <w:lvlText w:val="%2."/>
+      <w:lvlJc w:val="left"/>
+      <w:pPr>
+        <w:tabs>
+          <w:tab w:val="num" w:pos="1440"/>
+        </w:tabs>
+        <w:ind w:left="1440" w:hanging="360"/>
+      </w:pPr>
+    </w:lvl>
+    <w:lvl w:ilvl="2" w:tentative="1">
+      <w:start w:val="1"/>
+      <w:numFmt w:val="bullet"/>
+      <w:lvlText w:val=""/>
+      <w:lvlJc w:val="left"/>
+      <w:pPr>
+        <w:tabs>
+          <w:tab w:val="num" w:pos="2160"/>
+        </w:tabs>
+        <w:ind w:left="2160" w:hanging="360"/>
+      </w:pPr>
+      <w:rPr>
+        <w:rFonts w:ascii="Wingdings" w:hAnsi="Wingdings" w:hint="default"/>
+        <w:sz w:val="20"/>
+      </w:rPr>
+    </w:lvl>
+    <w:lvl w:ilvl="3" w:tentative="1">
+      <w:start w:val="1"/>
+      <w:numFmt w:val="bullet"/>
+      <w:lvlText w:val=""/>
+      <w:lvlJc w:val="left"/>
+      <w:pPr>
+        <w:tabs>
+          <w:tab w:val="num" w:pos="2880"/>
+        </w:tabs>
+        <w:ind w:left="2880" w:hanging="360"/>
+      </w:pPr>
+      <w:rPr>
+        <w:rFonts w:ascii="Wingdings" w:hAnsi="Wingdings" w:hint="default"/>
+        <w:sz w:val="20"/>
+      </w:rPr>
+    </w:lvl>
+    <w:lvl w:ilvl="4" w:tentative="1">
+      <w:start w:val="1"/>
+      <w:numFmt w:val="bullet"/>
+      <w:lvlText w:val=""/>
+      <w:lvlJc w:val="left"/>
+      <w:pPr>
+        <w:tabs>
+          <w:tab w:val="num" w:pos="3600"/>
+        </w:tabs>
+        <w:ind w:left="3600" w:hanging="360"/>
+      </w:pPr>
+      <w:rPr>
+        <w:rFonts w:ascii="Wingdings" w:hAnsi="Wingdings" w:hint="default"/>
+        <w:sz w:val="20"/>
+      </w:rPr>
+    </w:lvl>
+    <w:lvl w:ilvl="5" w:tentative="1">
+      <w:start w:val="1"/>
+      <w:numFmt w:val="bullet"/>
+      <w:lvlText w:val=""/>
+      <w:lvlJc w:val="left"/>
+      <w:pPr>
+        <w:tabs>
+          <w:tab w:val="num" w:pos="4320"/>
+        </w:tabs>
+        <w:ind w:left="4320" w:hanging="360"/>
+      </w:pPr>
+      <w:rPr>
+        <w:rFonts w:ascii="Wingdings" w:hAnsi="Wingdings" w:hint="default"/>
+        <w:sz w:val="20"/>
+      </w:rPr>
+    </w:lvl>
+    <w:lvl w:ilvl="6" w:tentative="1">
+      <w:start w:val="1"/>
+      <w:numFmt w:val="bullet"/>
+      <w:lvlText w:val=""/>
+      <w:lvlJc w:val="left"/>
+      <w:pPr>
+        <w:tabs>
+          <w:tab w:val="num" w:pos="5040"/>
+        </w:tabs>
+        <w:ind w:left="5040" w:hanging="360"/>
+      </w:pPr>
+      <w:rPr>
+        <w:rFonts w:ascii="Wingdings" w:hAnsi="Wingdings" w:hint="default"/>
+        <w:sz w:val="20"/>
+      </w:rPr>
+    </w:lvl>
+    <w:lvl w:ilvl="7" w:tentative="1">
+      <w:start w:val="1"/>
+      <w:numFmt w:val="bullet"/>
+      <w:lvlText w:val=""/>
+      <w:lvlJc w:val="left"/>
+      <w:pPr>
+        <w:tabs>
+          <w:tab w:val="num" w:pos="5760"/>
+        </w:tabs>
+        <w:ind w:left="5760" w:hanging="360"/>
+      </w:pPr>
+      <w:rPr>
+        <w:rFonts w:ascii="Wingdings" w:hAnsi="Wingdings" w:hint="default"/>
+        <w:sz w:val="20"/>
+      </w:rPr>
+    </w:lvl>
+    <w:lvl w:ilvl="8" w:tentative="1">
+      <w:start w:val="1"/>
+      <w:numFmt w:val="bullet"/>
+      <w:lvlText w:val=""/>
+      <w:lvlJc w:val="left"/>
+      <w:pPr>
+        <w:tabs>
+          <w:tab w:val="num" w:pos="6480"/>
+        </w:tabs>
+        <w:ind w:left="6480" w:hanging="360"/>
+      </w:pPr>
+      <w:rPr>
+        <w:rFonts w:ascii="Wingdings" w:hAnsi="Wingdings" w:hint="default"/>
+        <w:sz w:val="20"/>
+      </w:rPr>
+    </w:lvl>
+  </w:abstractNum>
+  <w:abstractNum w:abstractNumId="3" w15:restartNumberingAfterBreak="0">
+    <w:nsid w:val="2D9326A1"/>
+    <w:multiLevelType w:val="multilevel"/>
+    <w:tmpl w:val="5456B7B2"/>
+    <w:lvl w:ilvl="0">
+      <w:start w:val="1"/>
+      <w:numFmt w:val="bullet"/>
+      <w:lvlText w:val=""/>
+      <w:lvlJc w:val="left"/>
+      <w:pPr>
+        <w:tabs>
+          <w:tab w:val="num" w:pos="720"/>
+        </w:tabs>
+        <w:ind w:left="720" w:hanging="360"/>
+      </w:pPr>
+      <w:rPr>
+        <w:rFonts w:ascii="Symbol" w:hAnsi="Symbol" w:hint="default"/>
+        <w:sz w:val="20"/>
+      </w:rPr>
+    </w:lvl>
+    <w:lvl w:ilvl="1">
+      <w:start w:val="1"/>
+      <w:numFmt w:val="decimal"/>
+      <w:lvlText w:val="%2."/>
+      <w:lvlJc w:val="left"/>
+      <w:pPr>
+        <w:tabs>
+          <w:tab w:val="num" w:pos="1440"/>
+        </w:tabs>
+        <w:ind w:left="1440" w:hanging="360"/>
+      </w:pPr>
+    </w:lvl>
+    <w:lvl w:ilvl="2" w:tentative="1">
+      <w:start w:val="1"/>
+      <w:numFmt w:val="bullet"/>
+      <w:lvlText w:val=""/>
+      <w:lvlJc w:val="left"/>
+      <w:pPr>
+        <w:tabs>
+          <w:tab w:val="num" w:pos="2160"/>
+        </w:tabs>
+        <w:ind w:left="2160" w:hanging="360"/>
+      </w:pPr>
+      <w:rPr>
+        <w:rFonts w:ascii="Wingdings" w:hAnsi="Wingdings" w:hint="default"/>
+        <w:sz w:val="20"/>
+      </w:rPr>
+    </w:lvl>
+    <w:lvl w:ilvl="3" w:tentative="1">
+      <w:start w:val="1"/>
+      <w:numFmt w:val="bullet"/>
+      <w:lvlText w:val=""/>
+      <w:lvlJc w:val="left"/>
+      <w:pPr>
+        <w:tabs>
+          <w:tab w:val="num" w:pos="2880"/>
+        </w:tabs>
+        <w:ind w:left="2880" w:hanging="360"/>
+      </w:pPr>
+      <w:rPr>
+        <w:rFonts w:ascii="Wingdings" w:hAnsi="Wingdings" w:hint="default"/>
+        <w:sz w:val="20"/>
+      </w:rPr>
+    </w:lvl>
+    <w:lvl w:ilvl="4" w:tentative="1">
+      <w:start w:val="1"/>
+      <w:numFmt w:val="bullet"/>
+      <w:lvlText w:val=""/>
+      <w:lvlJc w:val="left"/>
+      <w:pPr>
+        <w:tabs>
+          <w:tab w:val="num" w:pos="3600"/>
+        </w:tabs>
+        <w:ind w:left="3600" w:hanging="360"/>
+      </w:pPr>
+      <w:rPr>
+        <w:rFonts w:ascii="Wingdings" w:hAnsi="Wingdings" w:hint="default"/>
+        <w:sz w:val="20"/>
+      </w:rPr>
+    </w:lvl>
+    <w:lvl w:ilvl="5" w:tentative="1">
+      <w:start w:val="1"/>
+      <w:numFmt w:val="bullet"/>
+      <w:lvlText w:val=""/>
+      <w:lvlJc w:val="left"/>
+      <w:pPr>
+        <w:tabs>
+          <w:tab w:val="num" w:pos="4320"/>
+        </w:tabs>
+        <w:ind w:left="4320" w:hanging="360"/>
+      </w:pPr>
+      <w:rPr>
+        <w:rFonts w:ascii="Wingdings" w:hAnsi="Wingdings" w:hint="default"/>
+        <w:sz w:val="20"/>
+      </w:rPr>
+    </w:lvl>
+    <w:lvl w:ilvl="6" w:tentative="1">
+      <w:start w:val="1"/>
+      <w:numFmt w:val="bullet"/>
+      <w:lvlText w:val=""/>
+      <w:lvlJc w:val="left"/>
+      <w:pPr>
+        <w:tabs>
+          <w:tab w:val="num" w:pos="5040"/>
+        </w:tabs>
+        <w:ind w:left="5040" w:hanging="360"/>
+      </w:pPr>
+      <w:rPr>
+        <w:rFonts w:ascii="Wingdings" w:hAnsi="Wingdings" w:hint="default"/>
+        <w:sz w:val="20"/>
+      </w:rPr>
+    </w:lvl>
+    <w:lvl w:ilvl="7" w:tentative="1">
+      <w:start w:val="1"/>
+      <w:numFmt w:val="bullet"/>
+      <w:lvlText w:val=""/>
+      <w:lvlJc w:val="left"/>
+      <w:pPr>
+        <w:tabs>
+          <w:tab w:val="num" w:pos="5760"/>
+        </w:tabs>
+        <w:ind w:left="5760" w:hanging="360"/>
+      </w:pPr>
+      <w:rPr>
+        <w:rFonts w:ascii="Wingdings" w:hAnsi="Wingdings" w:hint="default"/>
+        <w:sz w:val="20"/>
+      </w:rPr>
+    </w:lvl>
+    <w:lvl w:ilvl="8" w:tentative="1">
+      <w:start w:val="1"/>
+      <w:numFmt w:val="bullet"/>
+      <w:lvlText w:val=""/>
+      <w:lvlJc w:val="left"/>
+      <w:pPr>
+        <w:tabs>
+          <w:tab w:val="num" w:pos="6480"/>
+        </w:tabs>
+        <w:ind w:left="6480" w:hanging="360"/>
+      </w:pPr>
+      <w:rPr>
+        <w:rFonts w:ascii="Wingdings" w:hAnsi="Wingdings" w:hint="default"/>
+        <w:sz w:val="20"/>
+      </w:rPr>
+    </w:lvl>
+  </w:abstractNum>
+  <w:abstractNum w:abstractNumId="4" w15:restartNumberingAfterBreak="0">
+    <w:nsid w:val="2E5D4F34"/>
+    <w:multiLevelType w:val="multilevel"/>
+    <w:tmpl w:val="65B8C594"/>
+    <w:lvl w:ilvl="0">
+      <w:start w:val="1"/>
+      <w:numFmt w:val="bullet"/>
+      <w:lvlText w:val=""/>
+      <w:lvlJc w:val="left"/>
+      <w:pPr>
+        <w:tabs>
+          <w:tab w:val="num" w:pos="720"/>
+        </w:tabs>
+        <w:ind w:left="720" w:hanging="360"/>
+      </w:pPr>
+      <w:rPr>
+        <w:rFonts w:ascii="Symbol" w:hAnsi="Symbol" w:hint="default"/>
+        <w:sz w:val="20"/>
+      </w:rPr>
+    </w:lvl>
+    <w:lvl w:ilvl="1">
+      <w:start w:val="1"/>
+      <w:numFmt w:val="bullet"/>
+      <w:lvlText w:val="o"/>
+      <w:lvlJc w:val="left"/>
+      <w:pPr>
+        <w:tabs>
+          <w:tab w:val="num" w:pos="1440"/>
+        </w:tabs>
+        <w:ind w:left="1440" w:hanging="360"/>
+      </w:pPr>
+      <w:rPr>
+        <w:rFonts w:ascii="Courier New" w:hAnsi="Courier New" w:hint="default"/>
+        <w:sz w:val="20"/>
+      </w:rPr>
+    </w:lvl>
+    <w:lvl w:ilvl="2" w:tentative="1">
+      <w:start w:val="1"/>
+      <w:numFmt w:val="bullet"/>
+      <w:lvlText w:val=""/>
+      <w:lvlJc w:val="left"/>
+      <w:pPr>
+        <w:tabs>
+          <w:tab w:val="num" w:pos="2160"/>
+        </w:tabs>
+        <w:ind w:left="2160" w:hanging="360"/>
+      </w:pPr>
+      <w:rPr>
+        <w:rFonts w:ascii="Wingdings" w:hAnsi="Wingdings" w:hint="default"/>
+        <w:sz w:val="20"/>
+      </w:rPr>
+    </w:lvl>
+    <w:lvl w:ilvl="3" w:tentative="1">
+      <w:start w:val="1"/>
+      <w:numFmt w:val="bullet"/>
+      <w:lvlText w:val=""/>
+      <w:lvlJc w:val="left"/>
+      <w:pPr>
+        <w:tabs>
+          <w:tab w:val="num" w:pos="2880"/>
+        </w:tabs>
+        <w:ind w:left="2880" w:hanging="360"/>
+      </w:pPr>
+      <w:rPr>
+        <w:rFonts w:ascii="Wingdings" w:hAnsi="Wingdings" w:hint="default"/>
+        <w:sz w:val="20"/>
+      </w:rPr>
+    </w:lvl>
+    <w:lvl w:ilvl="4" w:tentative="1">
+      <w:start w:val="1"/>
+      <w:numFmt w:val="bullet"/>
+      <w:lvlText w:val=""/>
+      <w:lvlJc w:val="left"/>
+      <w:pPr>
+        <w:tabs>
+          <w:tab w:val="num" w:pos="3600"/>
+        </w:tabs>
+        <w:ind w:left="3600" w:hanging="360"/>
+      </w:pPr>
+      <w:rPr>
+        <w:rFonts w:ascii="Wingdings" w:hAnsi="Wingdings" w:hint="default"/>
+        <w:sz w:val="20"/>
+      </w:rPr>
+    </w:lvl>
+    <w:lvl w:ilvl="5" w:tentative="1">
+      <w:start w:val="1"/>
+      <w:numFmt w:val="bullet"/>
+      <w:lvlText w:val=""/>
+      <w:lvlJc w:val="left"/>
+      <w:pPr>
+        <w:tabs>
+          <w:tab w:val="num" w:pos="4320"/>
+        </w:tabs>
+        <w:ind w:left="4320" w:hanging="360"/>
+      </w:pPr>
+      <w:rPr>
+        <w:rFonts w:ascii="Wingdings" w:hAnsi="Wingdings" w:hint="default"/>
+        <w:sz w:val="20"/>
+      </w:rPr>
+    </w:lvl>
+    <w:lvl w:ilvl="6" w:tentative="1">
+      <w:start w:val="1"/>
+      <w:numFmt w:val="bullet"/>
+      <w:lvlText w:val=""/>
+      <w:lvlJc w:val="left"/>
+      <w:pPr>
+        <w:tabs>
+          <w:tab w:val="num" w:pos="5040"/>
+        </w:tabs>
+        <w:ind w:left="5040" w:hanging="360"/>
+      </w:pPr>
+      <w:rPr>
+        <w:rFonts w:ascii="Wingdings" w:hAnsi="Wingdings" w:hint="default"/>
+        <w:sz w:val="20"/>
+      </w:rPr>
+    </w:lvl>
+    <w:lvl w:ilvl="7" w:tentative="1">
+      <w:start w:val="1"/>
+      <w:numFmt w:val="bullet"/>
+      <w:lvlText w:val=""/>
+      <w:lvlJc w:val="left"/>
+      <w:pPr>
+        <w:tabs>
+          <w:tab w:val="num" w:pos="5760"/>
+        </w:tabs>
+        <w:ind w:left="5760" w:hanging="360"/>
+      </w:pPr>
+      <w:rPr>
+        <w:rFonts w:ascii="Wingdings" w:hAnsi="Wingdings" w:hint="default"/>
+        <w:sz w:val="20"/>
+      </w:rPr>
+    </w:lvl>
+    <w:lvl w:ilvl="8" w:tentative="1">
+      <w:start w:val="1"/>
+      <w:numFmt w:val="bullet"/>
+      <w:lvlText w:val=""/>
+      <w:lvlJc w:val="left"/>
+      <w:pPr>
+        <w:tabs>
+          <w:tab w:val="num" w:pos="6480"/>
+        </w:tabs>
+        <w:ind w:left="6480" w:hanging="360"/>
+      </w:pPr>
+      <w:rPr>
+        <w:rFonts w:ascii="Wingdings" w:hAnsi="Wingdings" w:hint="default"/>
+        <w:sz w:val="20"/>
+      </w:rPr>
+    </w:lvl>
+  </w:abstractNum>
+  <w:abstractNum w:abstractNumId="5" w15:restartNumberingAfterBreak="0">
+    <w:nsid w:val="33A04A67"/>
+    <w:multiLevelType w:val="multilevel"/>
+    <w:tmpl w:val="373673F2"/>
+    <w:lvl w:ilvl="0">
+      <w:start w:val="1"/>
+      <w:numFmt w:val="bullet"/>
+      <w:lvlText w:val=""/>
+      <w:lvlJc w:val="left"/>
+      <w:pPr>
+        <w:tabs>
+          <w:tab w:val="num" w:pos="720"/>
+        </w:tabs>
+        <w:ind w:left="720" w:hanging="360"/>
+      </w:pPr>
+      <w:rPr>
+        <w:rFonts w:ascii="Symbol" w:hAnsi="Symbol" w:hint="default"/>
+        <w:sz w:val="20"/>
+      </w:rPr>
+    </w:lvl>
+    <w:lvl w:ilvl="1" w:tentative="1">
+      <w:start w:val="1"/>
+      <w:numFmt w:val="bullet"/>
+      <w:lvlText w:val="o"/>
+      <w:lvlJc w:val="left"/>
+      <w:pPr>
+        <w:tabs>
+          <w:tab w:val="num" w:pos="1440"/>
+        </w:tabs>
+        <w:ind w:left="1440" w:hanging="360"/>
+      </w:pPr>
+      <w:rPr>
+        <w:rFonts w:ascii="Courier New" w:hAnsi="Courier New" w:hint="default"/>
+        <w:sz w:val="20"/>
+      </w:rPr>
+    </w:lvl>
+    <w:lvl w:ilvl="2" w:tentative="1">
+      <w:start w:val="1"/>
+      <w:numFmt w:val="bullet"/>
+      <w:lvlText w:val=""/>
+      <w:lvlJc w:val="left"/>
+      <w:pPr>
+        <w:tabs>
+          <w:tab w:val="num" w:pos="2160"/>
+        </w:tabs>
+        <w:ind w:left="2160" w:hanging="360"/>
+      </w:pPr>
+      <w:rPr>
+        <w:rFonts w:ascii="Wingdings" w:hAnsi="Wingdings" w:hint="default"/>
+        <w:sz w:val="20"/>
+      </w:rPr>
+    </w:lvl>
+    <w:lvl w:ilvl="3" w:tentative="1">
+      <w:start w:val="1"/>
+      <w:numFmt w:val="bullet"/>
+      <w:lvlText w:val=""/>
+      <w:lvlJc w:val="left"/>
+      <w:pPr>
+        <w:tabs>
+          <w:tab w:val="num" w:pos="2880"/>
+        </w:tabs>
+        <w:ind w:left="2880" w:hanging="360"/>
+      </w:pPr>
+      <w:rPr>
+        <w:rFonts w:ascii="Wingdings" w:hAnsi="Wingdings" w:hint="default"/>
+        <w:sz w:val="20"/>
+      </w:rPr>
+    </w:lvl>
+    <w:lvl w:ilvl="4" w:tentative="1">
+      <w:start w:val="1"/>
+      <w:numFmt w:val="bullet"/>
+      <w:lvlText w:val=""/>
+      <w:lvlJc w:val="left"/>
+      <w:pPr>
+        <w:tabs>
+          <w:tab w:val="num" w:pos="3600"/>
+        </w:tabs>
+        <w:ind w:left="3600" w:hanging="360"/>
+      </w:pPr>
+      <w:rPr>
+        <w:rFonts w:ascii="Wingdings" w:hAnsi="Wingdings" w:hint="default"/>
+        <w:sz w:val="20"/>
+      </w:rPr>
+    </w:lvl>
+    <w:lvl w:ilvl="5" w:tentative="1">
+      <w:start w:val="1"/>
+      <w:numFmt w:val="bullet"/>
+      <w:lvlText w:val=""/>
+      <w:lvlJc w:val="left"/>
+      <w:pPr>
+        <w:tabs>
+          <w:tab w:val="num" w:pos="4320"/>
+        </w:tabs>
+        <w:ind w:left="4320" w:hanging="360"/>
+      </w:pPr>
+      <w:rPr>
+        <w:rFonts w:ascii="Wingdings" w:hAnsi="Wingdings" w:hint="default"/>
+        <w:sz w:val="20"/>
+      </w:rPr>
+    </w:lvl>
+    <w:lvl w:ilvl="6" w:tentative="1">
+      <w:start w:val="1"/>
+      <w:numFmt w:val="bullet"/>
+      <w:lvlText w:val=""/>
+      <w:lvlJc w:val="left"/>
+      <w:pPr>
+        <w:tabs>
+          <w:tab w:val="num" w:pos="5040"/>
+        </w:tabs>
+        <w:ind w:left="5040" w:hanging="360"/>
+      </w:pPr>
+      <w:rPr>
+        <w:rFonts w:ascii="Wingdings" w:hAnsi="Wingdings" w:hint="default"/>
+        <w:sz w:val="20"/>
+      </w:rPr>
+    </w:lvl>
+    <w:lvl w:ilvl="7" w:tentative="1">
+      <w:start w:val="1"/>
+      <w:numFmt w:val="bullet"/>
+      <w:lvlText w:val=""/>
+      <w:lvlJc w:val="left"/>
+      <w:pPr>
+        <w:tabs>
+          <w:tab w:val="num" w:pos="5760"/>
+        </w:tabs>
+        <w:ind w:left="5760" w:hanging="360"/>
+      </w:pPr>
+      <w:rPr>
+        <w:rFonts w:ascii="Wingdings" w:hAnsi="Wingdings" w:hint="default"/>
+        <w:sz w:val="20"/>
+      </w:rPr>
+    </w:lvl>
+    <w:lvl w:ilvl="8" w:tentative="1">
+      <w:start w:val="1"/>
+      <w:numFmt w:val="bullet"/>
+      <w:lvlText w:val=""/>
+      <w:lvlJc w:val="left"/>
+      <w:pPr>
+        <w:tabs>
+          <w:tab w:val="num" w:pos="6480"/>
+        </w:tabs>
+        <w:ind w:left="6480" w:hanging="360"/>
+      </w:pPr>
+      <w:rPr>
+        <w:rFonts w:ascii="Wingdings" w:hAnsi="Wingdings" w:hint="default"/>
+        <w:sz w:val="20"/>
+      </w:rPr>
+    </w:lvl>
+  </w:abstractNum>
+  <w:abstractNum w:abstractNumId="6" w15:restartNumberingAfterBreak="0">
+    <w:nsid w:val="3CC64463"/>
+    <w:multiLevelType w:val="multilevel"/>
+    <w:tmpl w:val="9834A96A"/>
+    <w:lvl w:ilvl="0">
+      <w:start w:val="1"/>
+      <w:numFmt w:val="bullet"/>
+      <w:lvlText w:val=""/>
+      <w:lvlJc w:val="left"/>
+      <w:pPr>
+        <w:tabs>
+          <w:tab w:val="num" w:pos="720"/>
+        </w:tabs>
+        <w:ind w:left="720" w:hanging="360"/>
+      </w:pPr>
+      <w:rPr>
+        <w:rFonts w:ascii="Symbol" w:hAnsi="Symbol" w:hint="default"/>
+        <w:sz w:val="20"/>
+      </w:rPr>
+    </w:lvl>
+    <w:lvl w:ilvl="1">
+      <w:start w:val="1"/>
+      <w:numFmt w:val="bullet"/>
+      <w:lvlText w:val="o"/>
+      <w:lvlJc w:val="left"/>
+      <w:pPr>
+        <w:tabs>
+          <w:tab w:val="num" w:pos="1440"/>
+        </w:tabs>
+        <w:ind w:left="1440" w:hanging="360"/>
+      </w:pPr>
+      <w:rPr>
+        <w:rFonts w:ascii="Courier New" w:hAnsi="Courier New" w:hint="default"/>
+        <w:sz w:val="20"/>
+      </w:rPr>
+    </w:lvl>
+    <w:lvl w:ilvl="2" w:tentative="1">
+      <w:start w:val="1"/>
+      <w:numFmt w:val="bullet"/>
+      <w:lvlText w:val=""/>
+      <w:lvlJc w:val="left"/>
+      <w:pPr>
+        <w:tabs>
+          <w:tab w:val="num" w:pos="2160"/>
+        </w:tabs>
+        <w:ind w:left="2160" w:hanging="360"/>
+      </w:pPr>
+      <w:rPr>
+        <w:rFonts w:ascii="Wingdings" w:hAnsi="Wingdings" w:hint="default"/>
+        <w:sz w:val="20"/>
+      </w:rPr>
+    </w:lvl>
+    <w:lvl w:ilvl="3" w:tentative="1">
+      <w:start w:val="1"/>
+      <w:numFmt w:val="bullet"/>
+      <w:lvlText w:val=""/>
+      <w:lvlJc w:val="left"/>
+      <w:pPr>
+        <w:tabs>
+          <w:tab w:val="num" w:pos="2880"/>
+        </w:tabs>
+        <w:ind w:left="2880" w:hanging="360"/>
+      </w:pPr>
+      <w:rPr>
+        <w:rFonts w:ascii="Wingdings" w:hAnsi="Wingdings" w:hint="default"/>
+        <w:sz w:val="20"/>
+      </w:rPr>
+    </w:lvl>
+    <w:lvl w:ilvl="4" w:tentative="1">
+      <w:start w:val="1"/>
+      <w:numFmt w:val="bullet"/>
+      <w:lvlText w:val=""/>
+      <w:lvlJc w:val="left"/>
+      <w:pPr>
+        <w:tabs>
+          <w:tab w:val="num" w:pos="3600"/>
+        </w:tabs>
+        <w:ind w:left="3600" w:hanging="360"/>
+      </w:pPr>
+      <w:rPr>
+        <w:rFonts w:ascii="Wingdings" w:hAnsi="Wingdings" w:hint="default"/>
+        <w:sz w:val="20"/>
+      </w:rPr>
+    </w:lvl>
+    <w:lvl w:ilvl="5" w:tentative="1">
+      <w:start w:val="1"/>
+      <w:numFmt w:val="bullet"/>
+      <w:lvlText w:val=""/>
+      <w:lvlJc w:val="left"/>
+      <w:pPr>
+        <w:tabs>
+          <w:tab w:val="num" w:pos="4320"/>
+        </w:tabs>
+        <w:ind w:left="4320" w:hanging="360"/>
+      </w:pPr>
+      <w:rPr>
+        <w:rFonts w:ascii="Wingdings" w:hAnsi="Wingdings" w:hint="default"/>
+        <w:sz w:val="20"/>
+      </w:rPr>
+    </w:lvl>
+    <w:lvl w:ilvl="6" w:tentative="1">
+      <w:start w:val="1"/>
+      <w:numFmt w:val="bullet"/>
+      <w:lvlText w:val=""/>
+      <w:lvlJc w:val="left"/>
+      <w:pPr>
+        <w:tabs>
+          <w:tab w:val="num" w:pos="5040"/>
+        </w:tabs>
+        <w:ind w:left="5040" w:hanging="360"/>
+      </w:pPr>
+      <w:rPr>
+        <w:rFonts w:ascii="Wingdings" w:hAnsi="Wingdings" w:hint="default"/>
+        <w:sz w:val="20"/>
+      </w:rPr>
+    </w:lvl>
+    <w:lvl w:ilvl="7" w:tentative="1">
+      <w:start w:val="1"/>
+      <w:numFmt w:val="bullet"/>
+      <w:lvlText w:val=""/>
+      <w:lvlJc w:val="left"/>
+      <w:pPr>
+        <w:tabs>
+          <w:tab w:val="num" w:pos="5760"/>
+        </w:tabs>
+        <w:ind w:left="5760" w:hanging="360"/>
+      </w:pPr>
+      <w:rPr>
+        <w:rFonts w:ascii="Wingdings" w:hAnsi="Wingdings" w:hint="default"/>
+        <w:sz w:val="20"/>
+      </w:rPr>
+    </w:lvl>
+    <w:lvl w:ilvl="8" w:tentative="1">
+      <w:start w:val="1"/>
+      <w:numFmt w:val="bullet"/>
+      <w:lvlText w:val=""/>
+      <w:lvlJc w:val="left"/>
+      <w:pPr>
+        <w:tabs>
+          <w:tab w:val="num" w:pos="6480"/>
+        </w:tabs>
+        <w:ind w:left="6480" w:hanging="360"/>
+      </w:pPr>
+      <w:rPr>
+        <w:rFonts w:ascii="Wingdings" w:hAnsi="Wingdings" w:hint="default"/>
+        <w:sz w:val="20"/>
+      </w:rPr>
+    </w:lvl>
+  </w:abstractNum>
+  <w:abstractNum w:abstractNumId="7" w15:restartNumberingAfterBreak="0">
+    <w:nsid w:val="6F3D36B2"/>
+    <w:multiLevelType w:val="multilevel"/>
+    <w:tmpl w:val="16B6A06C"/>
+    <w:lvl w:ilvl="0">
+      <w:start w:val="1"/>
+      <w:numFmt w:val="bullet"/>
+      <w:lvlText w:val=""/>
+      <w:lvlJc w:val="left"/>
+      <w:pPr>
+        <w:tabs>
+          <w:tab w:val="num" w:pos="720"/>
+        </w:tabs>
+        <w:ind w:left="720" w:hanging="360"/>
+      </w:pPr>
+      <w:rPr>
+        <w:rFonts w:ascii="Symbol" w:hAnsi="Symbol" w:hint="default"/>
+        <w:sz w:val="20"/>
+      </w:rPr>
+    </w:lvl>
+    <w:lvl w:ilvl="1" w:tentative="1">
+      <w:start w:val="1"/>
+      <w:numFmt w:val="bullet"/>
+      <w:lvlText w:val="o"/>
+      <w:lvlJc w:val="left"/>
+      <w:pPr>
+        <w:tabs>
+          <w:tab w:val="num" w:pos="1440"/>
+        </w:tabs>
+        <w:ind w:left="1440" w:hanging="360"/>
+      </w:pPr>
+      <w:rPr>
+        <w:rFonts w:ascii="Courier New" w:hAnsi="Courier New" w:hint="default"/>
+        <w:sz w:val="20"/>
+      </w:rPr>
+    </w:lvl>
+    <w:lvl w:ilvl="2" w:tentative="1">
+      <w:start w:val="1"/>
+      <w:numFmt w:val="bullet"/>
+      <w:lvlText w:val=""/>
+      <w:lvlJc w:val="left"/>
+      <w:pPr>
+        <w:tabs>
+          <w:tab w:val="num" w:pos="2160"/>
+        </w:tabs>
+        <w:ind w:left="2160" w:hanging="360"/>
+      </w:pPr>
+      <w:rPr>
+        <w:rFonts w:ascii="Wingdings" w:hAnsi="Wingdings" w:hint="default"/>
+        <w:sz w:val="20"/>
+      </w:rPr>
+    </w:lvl>
+    <w:lvl w:ilvl="3" w:tentative="1">
+      <w:start w:val="1"/>
+      <w:numFmt w:val="bullet"/>
+      <w:lvlText w:val=""/>
+      <w:lvlJc w:val="left"/>
+      <w:pPr>
+        <w:tabs>
+          <w:tab w:val="num" w:pos="2880"/>
+        </w:tabs>
+        <w:ind w:left="2880" w:hanging="360"/>
+      </w:pPr>
+      <w:rPr>
+        <w:rFonts w:ascii="Wingdings" w:hAnsi="Wingdings" w:hint="default"/>
+        <w:sz w:val="20"/>
+      </w:rPr>
+    </w:lvl>
+    <w:lvl w:ilvl="4" w:tentative="1">
+      <w:start w:val="1"/>
+      <w:numFmt w:val="bullet"/>
+      <w:lvlText w:val=""/>
+      <w:lvlJc w:val="left"/>
+      <w:pPr>
+        <w:tabs>
+          <w:tab w:val="num" w:pos="3600"/>
+        </w:tabs>
+        <w:ind w:left="3600" w:hanging="360"/>
+      </w:pPr>
+      <w:rPr>
+        <w:rFonts w:ascii="Wingdings" w:hAnsi="Wingdings" w:hint="default"/>
+        <w:sz w:val="20"/>
+      </w:rPr>
+    </w:lvl>
+    <w:lvl w:ilvl="5" w:tentative="1">
+      <w:start w:val="1"/>
+      <w:numFmt w:val="bullet"/>
+      <w:lvlText w:val=""/>
+      <w:lvlJc w:val="left"/>
+      <w:pPr>
+        <w:tabs>
+          <w:tab w:val="num" w:pos="4320"/>
+        </w:tabs>
+        <w:ind w:left="4320" w:hanging="360"/>
+      </w:pPr>
+      <w:rPr>
+        <w:rFonts w:ascii="Wingdings" w:hAnsi="Wingdings" w:hint="default"/>
+        <w:sz w:val="20"/>
+      </w:rPr>
+    </w:lvl>
+    <w:lvl w:ilvl="6" w:tentative="1">
+      <w:start w:val="1"/>
+      <w:numFmt w:val="bullet"/>
+      <w:lvlText w:val=""/>
+      <w:lvlJc w:val="left"/>
+      <w:pPr>
+        <w:tabs>
+          <w:tab w:val="num" w:pos="5040"/>
+        </w:tabs>
+        <w:ind w:left="5040" w:hanging="360"/>
+      </w:pPr>
+      <w:rPr>
+        <w:rFonts w:ascii="Wingdings" w:hAnsi="Wingdings" w:hint="default"/>
+        <w:sz w:val="20"/>
+      </w:rPr>
+    </w:lvl>
+    <w:lvl w:ilvl="7" w:tentative="1">
+      <w:start w:val="1"/>
+      <w:numFmt w:val="bullet"/>
+      <w:lvlText w:val=""/>
+      <w:lvlJc w:val="left"/>
+      <w:pPr>
+        <w:tabs>
+          <w:tab w:val="num" w:pos="5760"/>
+        </w:tabs>
+        <w:ind w:left="5760" w:hanging="360"/>
+      </w:pPr>
+      <w:rPr>
+        <w:rFonts w:ascii="Wingdings" w:hAnsi="Wingdings" w:hint="default"/>
+        <w:sz w:val="20"/>
+      </w:rPr>
+    </w:lvl>
+    <w:lvl w:ilvl="8" w:tentative="1">
+      <w:start w:val="1"/>
+      <w:numFmt w:val="bullet"/>
+      <w:lvlText w:val=""/>
+      <w:lvlJc w:val="left"/>
+      <w:pPr>
+        <w:tabs>
+          <w:tab w:val="num" w:pos="6480"/>
+        </w:tabs>
+        <w:ind w:left="6480" w:hanging="360"/>
+      </w:pPr>
+      <w:rPr>
+        <w:rFonts w:ascii="Wingdings" w:hAnsi="Wingdings" w:hint="default"/>
+        <w:sz w:val="20"/>
+      </w:rPr>
+    </w:lvl>
+  </w:abstractNum>
+  <w:num w:numId="1" w16cid:durableId="1304696209">
+    <w:abstractNumId w:val="5"/>
+  </w:num>
+  <w:num w:numId="2" w16cid:durableId="998926503">
+    <w:abstractNumId w:val="0"/>
+  </w:num>
+  <w:num w:numId="3" w16cid:durableId="748037263">
+    <w:abstractNumId w:val="4"/>
+  </w:num>
+  <w:num w:numId="4" w16cid:durableId="1954366048">
+    <w:abstractNumId w:val="6"/>
+  </w:num>
+  <w:num w:numId="5" w16cid:durableId="1771855025">
+    <w:abstractNumId w:val="3"/>
+  </w:num>
+  <w:num w:numId="6" w16cid:durableId="345908049">
+    <w:abstractNumId w:val="2"/>
+  </w:num>
+  <w:num w:numId="7" w16cid:durableId="1094518413">
+    <w:abstractNumId w:val="1"/>
+  </w:num>
+  <w:num w:numId="8" w16cid:durableId="2123962483">
+    <w:abstractNumId w:val="7"/>
+  </w:num>
+</w:numbering>
 </file>
 
 <file path=word/styles.xml><?xml version="1.0" encoding="utf-8"?>
@@ -1425,7 +5296,6 @@
   <w:style w:type="character" w:default="1" w:styleId="Fuentedeprrafopredeter">
     <w:name w:val="Default Paragraph Font"/>
     <w:uiPriority w:val="1"/>
-    <w:semiHidden/>
     <w:unhideWhenUsed/>
   </w:style>
   <w:style w:type="table" w:default="1" w:styleId="Tablanormal">

</xml_diff>